<commit_message>
modificaion al frontend y se añadio un apartado de gaficas para resumenes de ventas y compras ademas de algunas validacion a interacciones
</commit_message>
<xml_diff>
--- a/docs/gestion/LIsta-de-cambios.docx
+++ b/docs/gestion/LIsta-de-cambios.docx
@@ -1,10 +1,10 @@
 
 <file path=word/document.xml><?xml version="1.0" encoding="utf-8"?>
-<w:document xmlns:wpc="http://schemas.microsoft.com/office/word/2010/wordprocessingCanvas" xmlns:cx="http://schemas.microsoft.com/office/drawing/2014/chartex" xmlns:cx1="http://schemas.microsoft.com/office/drawing/2015/9/8/chartex" xmlns:cx2="http://schemas.microsoft.com/office/drawing/2015/10/21/chartex" xmlns:cx3="http://schemas.microsoft.com/office/drawing/2016/5/9/chartex" xmlns:cx4="http://schemas.microsoft.com/office/drawing/2016/5/10/chartex" xmlns:cx5="http://schemas.microsoft.com/office/drawing/2016/5/11/chartex" xmlns:cx6="http://schemas.microsoft.com/office/drawing/2016/5/12/chartex" xmlns:cx7="http://schemas.microsoft.com/office/drawing/2016/5/13/chartex" xmlns:cx8="http://schemas.microsoft.com/office/drawing/2016/5/14/chartex" xmlns:mc="http://schemas.openxmlformats.org/markup-compatibility/2006" xmlns:aink="http://schemas.microsoft.com/office/drawing/2016/ink" xmlns:am3d="http://schemas.microsoft.com/office/drawing/2017/model3d" xmlns:o="urn:schemas-microsoft-com:office:office" xmlns:oel="http://schemas.microsoft.com/office/2019/extlst" xmlns:r="http://schemas.openxmlformats.org/officeDocument/2006/relationships" xmlns:m="http://schemas.openxmlformats.org/officeDocument/2006/math" xmlns:v="urn:schemas-microsoft-com:vml" xmlns:wp14="http://schemas.microsoft.com/office/word/2010/wordprocessingDrawing" xmlns:wp="http://schemas.openxmlformats.org/drawingml/2006/wordprocessingDrawing" xmlns:w10="urn:schemas-microsoft-com:office:word" xmlns:w="http://schemas.openxmlformats.org/wordprocessingml/2006/main" xmlns:w14="http://schemas.microsoft.com/office/word/2010/wordml" xmlns:w15="http://schemas.microsoft.com/office/word/2012/wordml" xmlns:w16cex="http://schemas.microsoft.com/office/word/2018/wordml/cex" xmlns:w16cid="http://schemas.microsoft.com/office/word/2016/wordml/cid" xmlns:w16="http://schemas.microsoft.com/office/word/2018/wordml" xmlns:w16du="http://schemas.microsoft.com/office/word/2023/wordml/word16du" xmlns:w16sdtdh="http://schemas.microsoft.com/office/word/2020/wordml/sdtdatahash" xmlns:w16sdtfl="http://schemas.microsoft.com/office/word/2024/wordml/sdtformatlock" xmlns:w16se="http://schemas.microsoft.com/office/word/2015/wordml/symex" xmlns:wpg="http://schemas.microsoft.com/office/word/2010/wordprocessingGroup" xmlns:wpi="http://schemas.microsoft.com/office/word/2010/wordprocessingInk" xmlns:wne="http://schemas.microsoft.com/office/word/2006/wordml" xmlns:wps="http://schemas.microsoft.com/office/word/2010/wordprocessingShape" mc:Ignorable="w14 w15 w16se w16cid w16 w16cex w16sdtdh w16sdtfl w16du wp14">
+<w:document xmlns:wpc="http://schemas.microsoft.com/office/word/2010/wordprocessingCanvas" xmlns:cx="http://schemas.microsoft.com/office/drawing/2014/chartex" xmlns:cx1="http://schemas.microsoft.com/office/drawing/2015/9/8/chartex" xmlns:cx2="http://schemas.microsoft.com/office/drawing/2015/10/21/chartex" xmlns:cx3="http://schemas.microsoft.com/office/drawing/2016/5/9/chartex" xmlns:cx4="http://schemas.microsoft.com/office/drawing/2016/5/10/chartex" xmlns:cx5="http://schemas.microsoft.com/office/drawing/2016/5/11/chartex" xmlns:cx6="http://schemas.microsoft.com/office/drawing/2016/5/12/chartex" xmlns:cx7="http://schemas.microsoft.com/office/drawing/2016/5/13/chartex" xmlns:cx8="http://schemas.microsoft.com/office/drawing/2016/5/14/chartex" xmlns:mc="http://schemas.openxmlformats.org/markup-compatibility/2006" xmlns:aink="http://schemas.microsoft.com/office/drawing/2016/ink" xmlns:am3d="http://schemas.microsoft.com/office/drawing/2017/model3d" xmlns:o="urn:schemas-microsoft-com:office:office" xmlns:oel="http://schemas.microsoft.com/office/2019/extlst" xmlns:r="http://schemas.openxmlformats.org/officeDocument/2006/relationships" xmlns:m="http://schemas.openxmlformats.org/officeDocument/2006/math" xmlns:v="urn:schemas-microsoft-com:vml" xmlns:wp14="http://schemas.microsoft.com/office/word/2010/wordprocessingDrawing" xmlns:wp="http://schemas.openxmlformats.org/drawingml/2006/wordprocessingDrawing" xmlns:w10="urn:schemas-microsoft-com:office:word" xmlns:w="http://schemas.openxmlformats.org/wordprocessingml/2006/main" xmlns:w14="http://schemas.microsoft.com/office/word/2010/wordml" xmlns:w15="http://schemas.microsoft.com/office/word/2012/wordml" xmlns:w16cex="http://schemas.microsoft.com/office/word/2018/wordml/cex" xmlns:w16cid="http://schemas.microsoft.com/office/word/2016/wordml/cid" xmlns:w16="http://schemas.microsoft.com/office/word/2018/wordml" xmlns:w16sdtdh="http://schemas.microsoft.com/office/word/2020/wordml/sdtdatahash" xmlns:w16se="http://schemas.microsoft.com/office/word/2015/wordml/symex" xmlns:wpg="http://schemas.microsoft.com/office/word/2010/wordprocessingGroup" xmlns:wpi="http://schemas.microsoft.com/office/word/2010/wordprocessingInk" xmlns:wne="http://schemas.microsoft.com/office/word/2006/wordml" xmlns:wps="http://schemas.microsoft.com/office/word/2010/wordprocessingShape" mc:Ignorable="w14 w15 w16se w16cid w16 w16cex w16sdtdh wp14">
   <w:body>
     <w:tbl>
       <w:tblPr>
-        <w:tblStyle w:val="TableGrid"/>
+        <w:tblStyle w:val="Tablaconcuadrcula"/>
         <w:tblpPr w:leftFromText="141" w:rightFromText="141" w:vertAnchor="text" w:horzAnchor="margin" w:tblpY="918"/>
         <w:tblW w:w="0" w:type="auto"/>
         <w:tblLook w:val="04A0" w:firstRow="1" w:lastRow="0" w:firstColumn="1" w:lastColumn="0" w:noHBand="0" w:noVBand="1"/>
@@ -137,13 +137,8 @@
             <w:tcW w:w="2186" w:type="dxa"/>
           </w:tcPr>
           <w:p>
-            <w:proofErr w:type="spellStart"/>
-            <w:r>
-              <w:t>Duvan</w:t>
-            </w:r>
-            <w:proofErr w:type="spellEnd"/>
-            <w:r>
-              <w:t xml:space="preserve"> A.</w:t>
+            <w:r>
+              <w:t>Duvan A.</w:t>
             </w:r>
           </w:p>
         </w:tc>
@@ -242,6 +237,326 @@
               <w:t>Salome A.</w:t>
             </w:r>
           </w:p>
+        </w:tc>
+      </w:tr>
+      <w:tr>
+        <w:tc>
+          <w:tcPr>
+            <w:tcW w:w="793" w:type="dxa"/>
+          </w:tcPr>
+          <w:p>
+            <w:r>
+              <w:t>3</w:t>
+            </w:r>
+          </w:p>
+          <w:p/>
+        </w:tc>
+        <w:tc>
+          <w:tcPr>
+            <w:tcW w:w="1470" w:type="dxa"/>
+          </w:tcPr>
+          <w:p>
+            <w:r>
+              <w:t>5/06/2026</w:t>
+            </w:r>
+          </w:p>
+        </w:tc>
+        <w:tc>
+          <w:tcPr>
+            <w:tcW w:w="4379" w:type="dxa"/>
+          </w:tcPr>
+          <w:p>
+            <w:r>
+              <w:t>Se hizo una modificación considerable en el proyecto:</w:t>
+            </w:r>
+          </w:p>
+          <w:p>
+            <w:r>
+              <w:t>0. Modificación en el documento original del proyecto (Se añadieron algunas mejoras)</w:t>
+            </w:r>
+            <w:r>
+              <w:br/>
+              <w:t xml:space="preserve">1. Se añadió gran parte del </w:t>
+            </w:r>
+            <w:proofErr w:type="spellStart"/>
+            <w:r>
+              <w:t>frontend</w:t>
+            </w:r>
+            <w:proofErr w:type="spellEnd"/>
+            <w:r>
+              <w:t>.</w:t>
+            </w:r>
+            <w:r>
+              <w:br/>
+              <w:t>2. Modificación de la base de datos.</w:t>
+            </w:r>
+            <w:r>
+              <w:br/>
+              <w:t xml:space="preserve">3. Se añadió gran parte del </w:t>
+            </w:r>
+            <w:proofErr w:type="spellStart"/>
+            <w:r>
+              <w:t>backend</w:t>
+            </w:r>
+            <w:proofErr w:type="spellEnd"/>
+            <w:r>
+              <w:t>.</w:t>
+            </w:r>
+          </w:p>
+          <w:p>
+            <w:r>
+              <w:t xml:space="preserve">4. Reestructuración de la arquitectura del </w:t>
+            </w:r>
+            <w:proofErr w:type="spellStart"/>
+            <w:r>
+              <w:t>github</w:t>
+            </w:r>
+            <w:proofErr w:type="spellEnd"/>
+            <w:r>
+              <w:t>.</w:t>
+            </w:r>
+          </w:p>
+          <w:p>
+            <w:r>
+              <w:t xml:space="preserve"> </w:t>
+            </w:r>
+          </w:p>
+        </w:tc>
+        <w:tc>
+          <w:tcPr>
+            <w:tcW w:w="2186" w:type="dxa"/>
+          </w:tcPr>
+          <w:p>
+            <w:r>
+              <w:t>Duvan A.</w:t>
+            </w:r>
+          </w:p>
+        </w:tc>
+      </w:tr>
+      <w:tr>
+        <w:tc>
+          <w:tcPr>
+            <w:tcW w:w="793" w:type="dxa"/>
+          </w:tcPr>
+          <w:p>
+            <w:r>
+              <w:t>4</w:t>
+            </w:r>
+          </w:p>
+        </w:tc>
+        <w:tc>
+          <w:tcPr>
+            <w:tcW w:w="1470" w:type="dxa"/>
+          </w:tcPr>
+          <w:p>
+            <w:r>
+              <w:t>6/06/2026</w:t>
+            </w:r>
+          </w:p>
+        </w:tc>
+        <w:tc>
+          <w:tcPr>
+            <w:tcW w:w="4379" w:type="dxa"/>
+          </w:tcPr>
+          <w:p>
+            <w:r>
+              <w:t xml:space="preserve">Se añadió un apartado de estadísticas en la parte del </w:t>
+            </w:r>
+            <w:proofErr w:type="spellStart"/>
+            <w:r>
+              <w:t>frontend</w:t>
+            </w:r>
+            <w:proofErr w:type="spellEnd"/>
+            <w:r>
+              <w:t xml:space="preserve"> para visualizar mucho más fácil las estadísticas de los gastos.</w:t>
+            </w:r>
+            <w:r>
+              <w:br/>
+              <w:t>Además se modifico el arranque del proyecto para que fuese mucho más fácil de iniciar con el script start.bat</w:t>
+            </w:r>
+          </w:p>
+        </w:tc>
+        <w:tc>
+          <w:tcPr>
+            <w:tcW w:w="2186" w:type="dxa"/>
+          </w:tcPr>
+          <w:p>
+            <w:r>
+              <w:t>Duvan A.</w:t>
+            </w:r>
+          </w:p>
+        </w:tc>
+      </w:tr>
+      <w:tr>
+        <w:tc>
+          <w:tcPr>
+            <w:tcW w:w="793" w:type="dxa"/>
+          </w:tcPr>
+          <w:p>
+            <w:r>
+              <w:t xml:space="preserve">5 </w:t>
+            </w:r>
+          </w:p>
+        </w:tc>
+        <w:tc>
+          <w:tcPr>
+            <w:tcW w:w="1470" w:type="dxa"/>
+          </w:tcPr>
+          <w:p>
+            <w:r>
+              <w:t>6/06/2026</w:t>
+            </w:r>
+          </w:p>
+        </w:tc>
+        <w:tc>
+          <w:tcPr>
+            <w:tcW w:w="4379" w:type="dxa"/>
+          </w:tcPr>
+          <w:p>
+            <w:r>
+              <w:t>Se añadieron validaciones en el apartado de cotizaciones para que no se permitirá registrar una cotización si la cantidad que s desea guardar es mayor a la cantidad disponible en stock.</w:t>
+            </w:r>
+          </w:p>
+        </w:tc>
+        <w:tc>
+          <w:tcPr>
+            <w:tcW w:w="2186" w:type="dxa"/>
+          </w:tcPr>
+          <w:p>
+            <w:r>
+              <w:t>Duvan A.</w:t>
+            </w:r>
+          </w:p>
+        </w:tc>
+      </w:tr>
+      <w:tr>
+        <w:tc>
+          <w:tcPr>
+            <w:tcW w:w="793" w:type="dxa"/>
+          </w:tcPr>
+          <w:p/>
+        </w:tc>
+        <w:tc>
+          <w:tcPr>
+            <w:tcW w:w="1470" w:type="dxa"/>
+          </w:tcPr>
+          <w:p/>
+        </w:tc>
+        <w:tc>
+          <w:tcPr>
+            <w:tcW w:w="4379" w:type="dxa"/>
+          </w:tcPr>
+          <w:p/>
+        </w:tc>
+        <w:tc>
+          <w:tcPr>
+            <w:tcW w:w="2186" w:type="dxa"/>
+          </w:tcPr>
+          <w:p/>
+        </w:tc>
+      </w:tr>
+      <w:tr>
+        <w:tc>
+          <w:tcPr>
+            <w:tcW w:w="793" w:type="dxa"/>
+          </w:tcPr>
+          <w:p/>
+        </w:tc>
+        <w:tc>
+          <w:tcPr>
+            <w:tcW w:w="1470" w:type="dxa"/>
+          </w:tcPr>
+          <w:p/>
+        </w:tc>
+        <w:tc>
+          <w:tcPr>
+            <w:tcW w:w="4379" w:type="dxa"/>
+          </w:tcPr>
+          <w:p/>
+        </w:tc>
+        <w:tc>
+          <w:tcPr>
+            <w:tcW w:w="2186" w:type="dxa"/>
+          </w:tcPr>
+          <w:p/>
+        </w:tc>
+      </w:tr>
+      <w:tr>
+        <w:tc>
+          <w:tcPr>
+            <w:tcW w:w="793" w:type="dxa"/>
+          </w:tcPr>
+          <w:p/>
+        </w:tc>
+        <w:tc>
+          <w:tcPr>
+            <w:tcW w:w="1470" w:type="dxa"/>
+          </w:tcPr>
+          <w:p/>
+        </w:tc>
+        <w:tc>
+          <w:tcPr>
+            <w:tcW w:w="4379" w:type="dxa"/>
+          </w:tcPr>
+          <w:p/>
+        </w:tc>
+        <w:tc>
+          <w:tcPr>
+            <w:tcW w:w="2186" w:type="dxa"/>
+          </w:tcPr>
+          <w:p/>
+        </w:tc>
+      </w:tr>
+      <w:tr>
+        <w:tc>
+          <w:tcPr>
+            <w:tcW w:w="793" w:type="dxa"/>
+          </w:tcPr>
+          <w:p/>
+        </w:tc>
+        <w:tc>
+          <w:tcPr>
+            <w:tcW w:w="1470" w:type="dxa"/>
+          </w:tcPr>
+          <w:p/>
+        </w:tc>
+        <w:tc>
+          <w:tcPr>
+            <w:tcW w:w="4379" w:type="dxa"/>
+          </w:tcPr>
+          <w:p/>
+        </w:tc>
+        <w:tc>
+          <w:tcPr>
+            <w:tcW w:w="2186" w:type="dxa"/>
+          </w:tcPr>
+          <w:p/>
+        </w:tc>
+      </w:tr>
+      <w:tr>
+        <w:tc>
+          <w:tcPr>
+            <w:tcW w:w="793" w:type="dxa"/>
+          </w:tcPr>
+          <w:p/>
+        </w:tc>
+        <w:tc>
+          <w:tcPr>
+            <w:tcW w:w="1470" w:type="dxa"/>
+          </w:tcPr>
+          <w:p/>
+        </w:tc>
+        <w:tc>
+          <w:tcPr>
+            <w:tcW w:w="4379" w:type="dxa"/>
+          </w:tcPr>
+          <w:p/>
+        </w:tc>
+        <w:tc>
+          <w:tcPr>
+            <w:tcW w:w="2186" w:type="dxa"/>
+          </w:tcPr>
+          <w:p/>
         </w:tc>
       </w:tr>
     </w:tbl>
@@ -276,7 +591,7 @@
 </file>
 
 <file path=word/styles.xml><?xml version="1.0" encoding="utf-8"?>
-<w:styles xmlns:mc="http://schemas.openxmlformats.org/markup-compatibility/2006" xmlns:r="http://schemas.openxmlformats.org/officeDocument/2006/relationships" xmlns:w="http://schemas.openxmlformats.org/wordprocessingml/2006/main" xmlns:w14="http://schemas.microsoft.com/office/word/2010/wordml" xmlns:w15="http://schemas.microsoft.com/office/word/2012/wordml" xmlns:w16cex="http://schemas.microsoft.com/office/word/2018/wordml/cex" xmlns:w16cid="http://schemas.microsoft.com/office/word/2016/wordml/cid" xmlns:w16="http://schemas.microsoft.com/office/word/2018/wordml" xmlns:w16du="http://schemas.microsoft.com/office/word/2023/wordml/word16du" xmlns:w16sdtdh="http://schemas.microsoft.com/office/word/2020/wordml/sdtdatahash" xmlns:w16sdtfl="http://schemas.microsoft.com/office/word/2024/wordml/sdtformatlock" xmlns:w16se="http://schemas.microsoft.com/office/word/2015/wordml/symex" mc:Ignorable="w14 w15 w16se w16cid w16 w16cex w16sdtdh w16sdtfl w16du">
+<w:styles xmlns:mc="http://schemas.openxmlformats.org/markup-compatibility/2006" xmlns:r="http://schemas.openxmlformats.org/officeDocument/2006/relationships" xmlns:w="http://schemas.openxmlformats.org/wordprocessingml/2006/main" xmlns:w14="http://schemas.microsoft.com/office/word/2010/wordml" xmlns:w15="http://schemas.microsoft.com/office/word/2012/wordml" xmlns:w16cex="http://schemas.microsoft.com/office/word/2018/wordml/cex" xmlns:w16cid="http://schemas.microsoft.com/office/word/2016/wordml/cid" xmlns:w16="http://schemas.microsoft.com/office/word/2018/wordml" xmlns:w16sdtdh="http://schemas.microsoft.com/office/word/2020/wordml/sdtdatahash" xmlns:w16se="http://schemas.microsoft.com/office/word/2015/wordml/symex" mc:Ignorable="w14 w15 w16se w16cid w16 w16cex w16sdtdh">
   <w:docDefaults>
     <w:rPrDefault>
       <w:rPr>
@@ -676,11 +991,11 @@
     <w:name w:val="Normal"/>
     <w:qFormat/>
   </w:style>
-  <w:style w:type="paragraph" w:styleId="Heading1">
+  <w:style w:type="paragraph" w:styleId="Ttulo1">
     <w:name w:val="heading 1"/>
     <w:basedOn w:val="Normal"/>
     <w:next w:val="Normal"/>
-    <w:link w:val="Heading1Char"/>
+    <w:link w:val="Ttulo1Car"/>
     <w:uiPriority w:val="9"/>
     <w:qFormat/>
     <w:rsid w:val="00131CF7"/>
@@ -697,11 +1012,11 @@
       <w:szCs w:val="40"/>
     </w:rPr>
   </w:style>
-  <w:style w:type="paragraph" w:styleId="Heading2">
+  <w:style w:type="paragraph" w:styleId="Ttulo2">
     <w:name w:val="heading 2"/>
     <w:basedOn w:val="Normal"/>
     <w:next w:val="Normal"/>
-    <w:link w:val="Heading2Char"/>
+    <w:link w:val="Ttulo2Car"/>
     <w:uiPriority w:val="9"/>
     <w:semiHidden/>
     <w:unhideWhenUsed/>
@@ -720,11 +1035,11 @@
       <w:szCs w:val="32"/>
     </w:rPr>
   </w:style>
-  <w:style w:type="paragraph" w:styleId="Heading3">
+  <w:style w:type="paragraph" w:styleId="Ttulo3">
     <w:name w:val="heading 3"/>
     <w:basedOn w:val="Normal"/>
     <w:next w:val="Normal"/>
-    <w:link w:val="Heading3Char"/>
+    <w:link w:val="Ttulo3Car"/>
     <w:uiPriority w:val="9"/>
     <w:semiHidden/>
     <w:unhideWhenUsed/>
@@ -743,11 +1058,11 @@
       <w:szCs w:val="28"/>
     </w:rPr>
   </w:style>
-  <w:style w:type="paragraph" w:styleId="Heading4">
+  <w:style w:type="paragraph" w:styleId="Ttulo4">
     <w:name w:val="heading 4"/>
     <w:basedOn w:val="Normal"/>
     <w:next w:val="Normal"/>
-    <w:link w:val="Heading4Char"/>
+    <w:link w:val="Ttulo4Car"/>
     <w:uiPriority w:val="9"/>
     <w:semiHidden/>
     <w:unhideWhenUsed/>
@@ -766,11 +1081,11 @@
       <w:color w:val="0F4761" w:themeColor="accent1" w:themeShade="BF"/>
     </w:rPr>
   </w:style>
-  <w:style w:type="paragraph" w:styleId="Heading5">
+  <w:style w:type="paragraph" w:styleId="Ttulo5">
     <w:name w:val="heading 5"/>
     <w:basedOn w:val="Normal"/>
     <w:next w:val="Normal"/>
-    <w:link w:val="Heading5Char"/>
+    <w:link w:val="Ttulo5Car"/>
     <w:uiPriority w:val="9"/>
     <w:semiHidden/>
     <w:unhideWhenUsed/>
@@ -787,11 +1102,11 @@
       <w:color w:val="0F4761" w:themeColor="accent1" w:themeShade="BF"/>
     </w:rPr>
   </w:style>
-  <w:style w:type="paragraph" w:styleId="Heading6">
+  <w:style w:type="paragraph" w:styleId="Ttulo6">
     <w:name w:val="heading 6"/>
     <w:basedOn w:val="Normal"/>
     <w:next w:val="Normal"/>
-    <w:link w:val="Heading6Char"/>
+    <w:link w:val="Ttulo6Car"/>
     <w:uiPriority w:val="9"/>
     <w:semiHidden/>
     <w:unhideWhenUsed/>
@@ -810,11 +1125,11 @@
       <w:color w:val="595959" w:themeColor="text1" w:themeTint="A6"/>
     </w:rPr>
   </w:style>
-  <w:style w:type="paragraph" w:styleId="Heading7">
+  <w:style w:type="paragraph" w:styleId="Ttulo7">
     <w:name w:val="heading 7"/>
     <w:basedOn w:val="Normal"/>
     <w:next w:val="Normal"/>
-    <w:link w:val="Heading7Char"/>
+    <w:link w:val="Ttulo7Car"/>
     <w:uiPriority w:val="9"/>
     <w:semiHidden/>
     <w:unhideWhenUsed/>
@@ -831,11 +1146,11 @@
       <w:color w:val="595959" w:themeColor="text1" w:themeTint="A6"/>
     </w:rPr>
   </w:style>
-  <w:style w:type="paragraph" w:styleId="Heading8">
+  <w:style w:type="paragraph" w:styleId="Ttulo8">
     <w:name w:val="heading 8"/>
     <w:basedOn w:val="Normal"/>
     <w:next w:val="Normal"/>
-    <w:link w:val="Heading8Char"/>
+    <w:link w:val="Ttulo8Car"/>
     <w:uiPriority w:val="9"/>
     <w:semiHidden/>
     <w:unhideWhenUsed/>
@@ -853,11 +1168,11 @@
       <w:color w:val="272727" w:themeColor="text1" w:themeTint="D8"/>
     </w:rPr>
   </w:style>
-  <w:style w:type="paragraph" w:styleId="Heading9">
+  <w:style w:type="paragraph" w:styleId="Ttulo9">
     <w:name w:val="heading 9"/>
     <w:basedOn w:val="Normal"/>
     <w:next w:val="Normal"/>
-    <w:link w:val="Heading9Char"/>
+    <w:link w:val="Ttulo9Car"/>
     <w:uiPriority w:val="9"/>
     <w:semiHidden/>
     <w:unhideWhenUsed/>
@@ -873,13 +1188,13 @@
       <w:color w:val="272727" w:themeColor="text1" w:themeTint="D8"/>
     </w:rPr>
   </w:style>
-  <w:style w:type="character" w:default="1" w:styleId="DefaultParagraphFont">
+  <w:style w:type="character" w:default="1" w:styleId="Fuentedeprrafopredeter">
     <w:name w:val="Default Paragraph Font"/>
     <w:uiPriority w:val="1"/>
     <w:semiHidden/>
     <w:unhideWhenUsed/>
   </w:style>
-  <w:style w:type="table" w:default="1" w:styleId="TableNormal">
+  <w:style w:type="table" w:default="1" w:styleId="Tablanormal">
     <w:name w:val="Normal Table"/>
     <w:uiPriority w:val="99"/>
     <w:semiHidden/>
@@ -894,16 +1209,16 @@
       </w:tblCellMar>
     </w:tblPr>
   </w:style>
-  <w:style w:type="numbering" w:default="1" w:styleId="NoList">
+  <w:style w:type="numbering" w:default="1" w:styleId="Sinlista">
     <w:name w:val="No List"/>
     <w:uiPriority w:val="99"/>
     <w:semiHidden/>
     <w:unhideWhenUsed/>
   </w:style>
-  <w:style w:type="character" w:customStyle="1" w:styleId="Heading1Char">
-    <w:name w:val="Heading 1 Char"/>
-    <w:basedOn w:val="DefaultParagraphFont"/>
-    <w:link w:val="Heading1"/>
+  <w:style w:type="character" w:customStyle="1" w:styleId="Ttulo1Car">
+    <w:name w:val="Título 1 Car"/>
+    <w:basedOn w:val="Fuentedeprrafopredeter"/>
+    <w:link w:val="Ttulo1"/>
     <w:uiPriority w:val="9"/>
     <w:rsid w:val="00131CF7"/>
     <w:rPr>
@@ -913,10 +1228,10 @@
       <w:szCs w:val="40"/>
     </w:rPr>
   </w:style>
-  <w:style w:type="character" w:customStyle="1" w:styleId="Heading2Char">
-    <w:name w:val="Heading 2 Char"/>
-    <w:basedOn w:val="DefaultParagraphFont"/>
-    <w:link w:val="Heading2"/>
+  <w:style w:type="character" w:customStyle="1" w:styleId="Ttulo2Car">
+    <w:name w:val="Título 2 Car"/>
+    <w:basedOn w:val="Fuentedeprrafopredeter"/>
+    <w:link w:val="Ttulo2"/>
     <w:uiPriority w:val="9"/>
     <w:semiHidden/>
     <w:rsid w:val="00131CF7"/>
@@ -927,10 +1242,10 @@
       <w:szCs w:val="32"/>
     </w:rPr>
   </w:style>
-  <w:style w:type="character" w:customStyle="1" w:styleId="Heading3Char">
-    <w:name w:val="Heading 3 Char"/>
-    <w:basedOn w:val="DefaultParagraphFont"/>
-    <w:link w:val="Heading3"/>
+  <w:style w:type="character" w:customStyle="1" w:styleId="Ttulo3Car">
+    <w:name w:val="Título 3 Car"/>
+    <w:basedOn w:val="Fuentedeprrafopredeter"/>
+    <w:link w:val="Ttulo3"/>
     <w:uiPriority w:val="9"/>
     <w:semiHidden/>
     <w:rsid w:val="00131CF7"/>
@@ -941,10 +1256,10 @@
       <w:szCs w:val="28"/>
     </w:rPr>
   </w:style>
-  <w:style w:type="character" w:customStyle="1" w:styleId="Heading4Char">
-    <w:name w:val="Heading 4 Char"/>
-    <w:basedOn w:val="DefaultParagraphFont"/>
-    <w:link w:val="Heading4"/>
+  <w:style w:type="character" w:customStyle="1" w:styleId="Ttulo4Car">
+    <w:name w:val="Título 4 Car"/>
+    <w:basedOn w:val="Fuentedeprrafopredeter"/>
+    <w:link w:val="Ttulo4"/>
     <w:uiPriority w:val="9"/>
     <w:semiHidden/>
     <w:rsid w:val="00131CF7"/>
@@ -955,10 +1270,10 @@
       <w:color w:val="0F4761" w:themeColor="accent1" w:themeShade="BF"/>
     </w:rPr>
   </w:style>
-  <w:style w:type="character" w:customStyle="1" w:styleId="Heading5Char">
-    <w:name w:val="Heading 5 Char"/>
-    <w:basedOn w:val="DefaultParagraphFont"/>
-    <w:link w:val="Heading5"/>
+  <w:style w:type="character" w:customStyle="1" w:styleId="Ttulo5Car">
+    <w:name w:val="Título 5 Car"/>
+    <w:basedOn w:val="Fuentedeprrafopredeter"/>
+    <w:link w:val="Ttulo5"/>
     <w:uiPriority w:val="9"/>
     <w:semiHidden/>
     <w:rsid w:val="00131CF7"/>
@@ -967,10 +1282,10 @@
       <w:color w:val="0F4761" w:themeColor="accent1" w:themeShade="BF"/>
     </w:rPr>
   </w:style>
-  <w:style w:type="character" w:customStyle="1" w:styleId="Heading6Char">
-    <w:name w:val="Heading 6 Char"/>
-    <w:basedOn w:val="DefaultParagraphFont"/>
-    <w:link w:val="Heading6"/>
+  <w:style w:type="character" w:customStyle="1" w:styleId="Ttulo6Car">
+    <w:name w:val="Título 6 Car"/>
+    <w:basedOn w:val="Fuentedeprrafopredeter"/>
+    <w:link w:val="Ttulo6"/>
     <w:uiPriority w:val="9"/>
     <w:semiHidden/>
     <w:rsid w:val="00131CF7"/>
@@ -981,10 +1296,10 @@
       <w:color w:val="595959" w:themeColor="text1" w:themeTint="A6"/>
     </w:rPr>
   </w:style>
-  <w:style w:type="character" w:customStyle="1" w:styleId="Heading7Char">
-    <w:name w:val="Heading 7 Char"/>
-    <w:basedOn w:val="DefaultParagraphFont"/>
-    <w:link w:val="Heading7"/>
+  <w:style w:type="character" w:customStyle="1" w:styleId="Ttulo7Car">
+    <w:name w:val="Título 7 Car"/>
+    <w:basedOn w:val="Fuentedeprrafopredeter"/>
+    <w:link w:val="Ttulo7"/>
     <w:uiPriority w:val="9"/>
     <w:semiHidden/>
     <w:rsid w:val="00131CF7"/>
@@ -993,10 +1308,10 @@
       <w:color w:val="595959" w:themeColor="text1" w:themeTint="A6"/>
     </w:rPr>
   </w:style>
-  <w:style w:type="character" w:customStyle="1" w:styleId="Heading8Char">
-    <w:name w:val="Heading 8 Char"/>
-    <w:basedOn w:val="DefaultParagraphFont"/>
-    <w:link w:val="Heading8"/>
+  <w:style w:type="character" w:customStyle="1" w:styleId="Ttulo8Car">
+    <w:name w:val="Título 8 Car"/>
+    <w:basedOn w:val="Fuentedeprrafopredeter"/>
+    <w:link w:val="Ttulo8"/>
     <w:uiPriority w:val="9"/>
     <w:semiHidden/>
     <w:rsid w:val="00131CF7"/>
@@ -1007,10 +1322,10 @@
       <w:color w:val="272727" w:themeColor="text1" w:themeTint="D8"/>
     </w:rPr>
   </w:style>
-  <w:style w:type="character" w:customStyle="1" w:styleId="Heading9Char">
-    <w:name w:val="Heading 9 Char"/>
-    <w:basedOn w:val="DefaultParagraphFont"/>
-    <w:link w:val="Heading9"/>
+  <w:style w:type="character" w:customStyle="1" w:styleId="Ttulo9Car">
+    <w:name w:val="Título 9 Car"/>
+    <w:basedOn w:val="Fuentedeprrafopredeter"/>
+    <w:link w:val="Ttulo9"/>
     <w:uiPriority w:val="9"/>
     <w:semiHidden/>
     <w:rsid w:val="00131CF7"/>
@@ -1019,11 +1334,11 @@
       <w:color w:val="272727" w:themeColor="text1" w:themeTint="D8"/>
     </w:rPr>
   </w:style>
-  <w:style w:type="paragraph" w:styleId="Title">
+  <w:style w:type="paragraph" w:styleId="Ttulo">
     <w:name w:val="Title"/>
     <w:basedOn w:val="Normal"/>
     <w:next w:val="Normal"/>
-    <w:link w:val="TitleChar"/>
+    <w:link w:val="TtuloCar"/>
     <w:uiPriority w:val="10"/>
     <w:qFormat/>
     <w:rsid w:val="00131CF7"/>
@@ -1039,10 +1354,10 @@
       <w:szCs w:val="56"/>
     </w:rPr>
   </w:style>
-  <w:style w:type="character" w:customStyle="1" w:styleId="TitleChar">
-    <w:name w:val="Title Char"/>
-    <w:basedOn w:val="DefaultParagraphFont"/>
-    <w:link w:val="Title"/>
+  <w:style w:type="character" w:customStyle="1" w:styleId="TtuloCar">
+    <w:name w:val="Título Car"/>
+    <w:basedOn w:val="Fuentedeprrafopredeter"/>
+    <w:link w:val="Ttulo"/>
     <w:uiPriority w:val="10"/>
     <w:rsid w:val="00131CF7"/>
     <w:rPr>
@@ -1053,11 +1368,11 @@
       <w:szCs w:val="56"/>
     </w:rPr>
   </w:style>
-  <w:style w:type="paragraph" w:styleId="Subtitle">
+  <w:style w:type="paragraph" w:styleId="Subttulo">
     <w:name w:val="Subtitle"/>
     <w:basedOn w:val="Normal"/>
     <w:next w:val="Normal"/>
-    <w:link w:val="SubtitleChar"/>
+    <w:link w:val="SubttuloCar"/>
     <w:uiPriority w:val="11"/>
     <w:qFormat/>
     <w:rsid w:val="00131CF7"/>
@@ -1074,10 +1389,10 @@
       <w:szCs w:val="28"/>
     </w:rPr>
   </w:style>
-  <w:style w:type="character" w:customStyle="1" w:styleId="SubtitleChar">
-    <w:name w:val="Subtitle Char"/>
-    <w:basedOn w:val="DefaultParagraphFont"/>
-    <w:link w:val="Subtitle"/>
+  <w:style w:type="character" w:customStyle="1" w:styleId="SubttuloCar">
+    <w:name w:val="Subtítulo Car"/>
+    <w:basedOn w:val="Fuentedeprrafopredeter"/>
+    <w:link w:val="Subttulo"/>
     <w:uiPriority w:val="11"/>
     <w:rsid w:val="00131CF7"/>
     <w:rPr>
@@ -1088,11 +1403,11 @@
       <w:szCs w:val="28"/>
     </w:rPr>
   </w:style>
-  <w:style w:type="paragraph" w:styleId="Quote">
+  <w:style w:type="paragraph" w:styleId="Cita">
     <w:name w:val="Quote"/>
     <w:basedOn w:val="Normal"/>
     <w:next w:val="Normal"/>
-    <w:link w:val="QuoteChar"/>
+    <w:link w:val="CitaCar"/>
     <w:uiPriority w:val="29"/>
     <w:qFormat/>
     <w:rsid w:val="00131CF7"/>
@@ -1106,10 +1421,10 @@
       <w:color w:val="404040" w:themeColor="text1" w:themeTint="BF"/>
     </w:rPr>
   </w:style>
-  <w:style w:type="character" w:customStyle="1" w:styleId="QuoteChar">
-    <w:name w:val="Quote Char"/>
-    <w:basedOn w:val="DefaultParagraphFont"/>
-    <w:link w:val="Quote"/>
+  <w:style w:type="character" w:customStyle="1" w:styleId="CitaCar">
+    <w:name w:val="Cita Car"/>
+    <w:basedOn w:val="Fuentedeprrafopredeter"/>
+    <w:link w:val="Cita"/>
     <w:uiPriority w:val="29"/>
     <w:rsid w:val="00131CF7"/>
     <w:rPr>
@@ -1118,7 +1433,7 @@
       <w:color w:val="404040" w:themeColor="text1" w:themeTint="BF"/>
     </w:rPr>
   </w:style>
-  <w:style w:type="paragraph" w:styleId="ListParagraph">
+  <w:style w:type="paragraph" w:styleId="Prrafodelista">
     <w:name w:val="List Paragraph"/>
     <w:basedOn w:val="Normal"/>
     <w:uiPriority w:val="34"/>
@@ -1129,9 +1444,9 @@
       <w:contextualSpacing/>
     </w:pPr>
   </w:style>
-  <w:style w:type="character" w:styleId="IntenseEmphasis">
+  <w:style w:type="character" w:styleId="nfasisintenso">
     <w:name w:val="Intense Emphasis"/>
-    <w:basedOn w:val="DefaultParagraphFont"/>
+    <w:basedOn w:val="Fuentedeprrafopredeter"/>
     <w:uiPriority w:val="21"/>
     <w:qFormat/>
     <w:rsid w:val="00131CF7"/>
@@ -1141,11 +1456,11 @@
       <w:color w:val="0F4761" w:themeColor="accent1" w:themeShade="BF"/>
     </w:rPr>
   </w:style>
-  <w:style w:type="paragraph" w:styleId="IntenseQuote">
+  <w:style w:type="paragraph" w:styleId="Citadestacada">
     <w:name w:val="Intense Quote"/>
     <w:basedOn w:val="Normal"/>
     <w:next w:val="Normal"/>
-    <w:link w:val="IntenseQuoteChar"/>
+    <w:link w:val="CitadestacadaCar"/>
     <w:uiPriority w:val="30"/>
     <w:qFormat/>
     <w:rsid w:val="00131CF7"/>
@@ -1164,10 +1479,10 @@
       <w:color w:val="0F4761" w:themeColor="accent1" w:themeShade="BF"/>
     </w:rPr>
   </w:style>
-  <w:style w:type="character" w:customStyle="1" w:styleId="IntenseQuoteChar">
-    <w:name w:val="Intense Quote Char"/>
-    <w:basedOn w:val="DefaultParagraphFont"/>
-    <w:link w:val="IntenseQuote"/>
+  <w:style w:type="character" w:customStyle="1" w:styleId="CitadestacadaCar">
+    <w:name w:val="Cita destacada Car"/>
+    <w:basedOn w:val="Fuentedeprrafopredeter"/>
+    <w:link w:val="Citadestacada"/>
     <w:uiPriority w:val="30"/>
     <w:rsid w:val="00131CF7"/>
     <w:rPr>
@@ -1176,9 +1491,9 @@
       <w:color w:val="0F4761" w:themeColor="accent1" w:themeShade="BF"/>
     </w:rPr>
   </w:style>
-  <w:style w:type="character" w:styleId="IntenseReference">
+  <w:style w:type="character" w:styleId="Referenciaintensa">
     <w:name w:val="Intense Reference"/>
-    <w:basedOn w:val="DefaultParagraphFont"/>
+    <w:basedOn w:val="Fuentedeprrafopredeter"/>
     <w:uiPriority w:val="32"/>
     <w:qFormat/>
     <w:rsid w:val="00131CF7"/>
@@ -1190,9 +1505,9 @@
       <w:spacing w:val="5"/>
     </w:rPr>
   </w:style>
-  <w:style w:type="table" w:styleId="TableGrid">
+  <w:style w:type="table" w:styleId="Tablaconcuadrcula">
     <w:name w:val="Table Grid"/>
-    <w:basedOn w:val="TableNormal"/>
+    <w:basedOn w:val="Tablanormal"/>
     <w:uiPriority w:val="39"/>
     <w:rsid w:val="00131CF7"/>
     <w:pPr>

</xml_diff>

<commit_message>
Actualizar lista de cambios
</commit_message>
<xml_diff>
--- a/docs/gestion/LIsta-de-cambios.docx
+++ b/docs/gestion/LIsta-de-cambios.docx
@@ -1,10 +1,10 @@
 
 <file path=word/document.xml><?xml version="1.0" encoding="utf-8"?>
-<w:document xmlns:wpc="http://schemas.microsoft.com/office/word/2010/wordprocessingCanvas" xmlns:cx="http://schemas.microsoft.com/office/drawing/2014/chartex" xmlns:cx1="http://schemas.microsoft.com/office/drawing/2015/9/8/chartex" xmlns:cx2="http://schemas.microsoft.com/office/drawing/2015/10/21/chartex" xmlns:cx3="http://schemas.microsoft.com/office/drawing/2016/5/9/chartex" xmlns:cx4="http://schemas.microsoft.com/office/drawing/2016/5/10/chartex" xmlns:cx5="http://schemas.microsoft.com/office/drawing/2016/5/11/chartex" xmlns:cx6="http://schemas.microsoft.com/office/drawing/2016/5/12/chartex" xmlns:cx7="http://schemas.microsoft.com/office/drawing/2016/5/13/chartex" xmlns:cx8="http://schemas.microsoft.com/office/drawing/2016/5/14/chartex" xmlns:mc="http://schemas.openxmlformats.org/markup-compatibility/2006" xmlns:aink="http://schemas.microsoft.com/office/drawing/2016/ink" xmlns:am3d="http://schemas.microsoft.com/office/drawing/2017/model3d" xmlns:o="urn:schemas-microsoft-com:office:office" xmlns:oel="http://schemas.microsoft.com/office/2019/extlst" xmlns:r="http://schemas.openxmlformats.org/officeDocument/2006/relationships" xmlns:m="http://schemas.openxmlformats.org/officeDocument/2006/math" xmlns:v="urn:schemas-microsoft-com:vml" xmlns:wp14="http://schemas.microsoft.com/office/word/2010/wordprocessingDrawing" xmlns:wp="http://schemas.openxmlformats.org/drawingml/2006/wordprocessingDrawing" xmlns:w10="urn:schemas-microsoft-com:office:word" xmlns:w="http://schemas.openxmlformats.org/wordprocessingml/2006/main" xmlns:w14="http://schemas.microsoft.com/office/word/2010/wordml" xmlns:w15="http://schemas.microsoft.com/office/word/2012/wordml" xmlns:w16cex="http://schemas.microsoft.com/office/word/2018/wordml/cex" xmlns:w16cid="http://schemas.microsoft.com/office/word/2016/wordml/cid" xmlns:w16="http://schemas.microsoft.com/office/word/2018/wordml" xmlns:w16sdtdh="http://schemas.microsoft.com/office/word/2020/wordml/sdtdatahash" xmlns:w16se="http://schemas.microsoft.com/office/word/2015/wordml/symex" xmlns:wpg="http://schemas.microsoft.com/office/word/2010/wordprocessingGroup" xmlns:wpi="http://schemas.microsoft.com/office/word/2010/wordprocessingInk" xmlns:wne="http://schemas.microsoft.com/office/word/2006/wordml" xmlns:wps="http://schemas.microsoft.com/office/word/2010/wordprocessingShape" mc:Ignorable="w14 w15 w16se w16cid w16 w16cex w16sdtdh wp14">
+<w:document xmlns:wpc="http://schemas.microsoft.com/office/word/2010/wordprocessingCanvas" xmlns:cx="http://schemas.microsoft.com/office/drawing/2014/chartex" xmlns:cx1="http://schemas.microsoft.com/office/drawing/2015/9/8/chartex" xmlns:cx2="http://schemas.microsoft.com/office/drawing/2015/10/21/chartex" xmlns:cx3="http://schemas.microsoft.com/office/drawing/2016/5/9/chartex" xmlns:cx4="http://schemas.microsoft.com/office/drawing/2016/5/10/chartex" xmlns:cx5="http://schemas.microsoft.com/office/drawing/2016/5/11/chartex" xmlns:cx6="http://schemas.microsoft.com/office/drawing/2016/5/12/chartex" xmlns:cx7="http://schemas.microsoft.com/office/drawing/2016/5/13/chartex" xmlns:cx8="http://schemas.microsoft.com/office/drawing/2016/5/14/chartex" xmlns:mc="http://schemas.openxmlformats.org/markup-compatibility/2006" xmlns:aink="http://schemas.microsoft.com/office/drawing/2016/ink" xmlns:am3d="http://schemas.microsoft.com/office/drawing/2017/model3d" xmlns:o="urn:schemas-microsoft-com:office:office" xmlns:oel="http://schemas.microsoft.com/office/2019/extlst" xmlns:r="http://schemas.openxmlformats.org/officeDocument/2006/relationships" xmlns:m="http://schemas.openxmlformats.org/officeDocument/2006/math" xmlns:v="urn:schemas-microsoft-com:vml" xmlns:wp14="http://schemas.microsoft.com/office/word/2010/wordprocessingDrawing" xmlns:wp="http://schemas.openxmlformats.org/drawingml/2006/wordprocessingDrawing" xmlns:w10="urn:schemas-microsoft-com:office:word" xmlns:w="http://schemas.openxmlformats.org/wordprocessingml/2006/main" xmlns:w14="http://schemas.microsoft.com/office/word/2010/wordml" xmlns:w15="http://schemas.microsoft.com/office/word/2012/wordml" xmlns:w16cex="http://schemas.microsoft.com/office/word/2018/wordml/cex" xmlns:w16cid="http://schemas.microsoft.com/office/word/2016/wordml/cid" xmlns:w16="http://schemas.microsoft.com/office/word/2018/wordml" xmlns:w16du="http://schemas.microsoft.com/office/word/2023/wordml/word16du" xmlns:w16sdtdh="http://schemas.microsoft.com/office/word/2020/wordml/sdtdatahash" xmlns:w16sdtfl="http://schemas.microsoft.com/office/word/2024/wordml/sdtformatlock" xmlns:w16se="http://schemas.microsoft.com/office/word/2015/wordml/symex" xmlns:wpg="http://schemas.microsoft.com/office/word/2010/wordprocessingGroup" xmlns:wpi="http://schemas.microsoft.com/office/word/2010/wordprocessingInk" xmlns:wne="http://schemas.microsoft.com/office/word/2006/wordml" xmlns:wps="http://schemas.microsoft.com/office/word/2010/wordprocessingShape" mc:Ignorable="w14 w15 w16se w16cid w16 w16cex w16sdtdh w16sdtfl w16du wp14">
   <w:body>
     <w:tbl>
       <w:tblPr>
-        <w:tblStyle w:val="Tablaconcuadrcula"/>
+        <w:tblStyle w:val="TableGrid"/>
         <w:tblpPr w:leftFromText="141" w:rightFromText="141" w:vertAnchor="text" w:horzAnchor="margin" w:tblpY="918"/>
         <w:tblW w:w="0" w:type="auto"/>
         <w:tblLook w:val="04A0" w:firstRow="1" w:lastRow="0" w:firstColumn="1" w:lastColumn="0" w:noHBand="0" w:noVBand="1"/>
@@ -116,11 +116,43 @@
           <w:tcPr>
             <w:tcW w:w="1470" w:type="dxa"/>
           </w:tcPr>
-          <w:p>
-            <w:r>
-              <w:t>23/03/2026</w:t>
-            </w:r>
-          </w:p>
+          <w:tbl>
+            <w:tblPr>
+              <w:tblW w:w="0" w:type="auto"/>
+              <w:tblCellSpacing w:w="15" w:type="dxa"/>
+              <w:tblCellMar>
+                <w:top w:w="15" w:type="dxa"/>
+                <w:left w:w="15" w:type="dxa"/>
+                <w:bottom w:w="15" w:type="dxa"/>
+                <w:right w:w="15" w:type="dxa"/>
+              </w:tblCellMar>
+              <w:tblLook w:val="04A0" w:firstRow="1" w:lastRow="0" w:firstColumn="1" w:lastColumn="0" w:noHBand="0" w:noVBand="1"/>
+            </w:tblPr>
+            <w:tblGrid>
+              <w:gridCol w:w="1184"/>
+            </w:tblGrid>
+            <w:tr>
+              <w:trPr>
+                <w:tblCellSpacing w:w="15" w:type="dxa"/>
+              </w:trPr>
+              <w:tc>
+                <w:tcPr>
+                  <w:tcW w:w="0" w:type="auto"/>
+                  <w:vAlign w:val="center"/>
+                  <w:hideMark/>
+                </w:tcPr>
+                <w:p>
+                  <w:pPr>
+                    <w:framePr w:hSpace="141" w:wrap="around" w:vAnchor="text" w:hAnchor="margin" w:y="918"/>
+                  </w:pPr>
+                  <w:r>
+                    <w:t>14/03/2026</w:t>
+                  </w:r>
+                </w:p>
+              </w:tc>
+            </w:tr>
+          </w:tbl>
+          <w:p/>
         </w:tc>
         <w:tc>
           <w:tcPr>
@@ -128,7 +160,15 @@
           </w:tcPr>
           <w:p>
             <w:r>
-              <w:t>Se añadió el documento Diseño del sistema a la rama de Actividades en la carpeta de /ENTREGAS y además se añadió a la carpeta de /EVIDENCIAS en formato .png el diagrama de despliegue</w:t>
+              <w:t xml:space="preserve">Se añadió el documento correspondiente a la Actividad 1 del proyecto </w:t>
+            </w:r>
+            <w:proofErr w:type="spellStart"/>
+            <w:r>
+              <w:t>Emplanorte</w:t>
+            </w:r>
+            <w:proofErr w:type="spellEnd"/>
+            <w:r>
+              <w:t>.</w:t>
             </w:r>
           </w:p>
         </w:tc>
@@ -138,7 +178,7 @@
           </w:tcPr>
           <w:p>
             <w:r>
-              <w:t>Duvan A.</w:t>
+              <w:t>Salomé A.</w:t>
             </w:r>
           </w:p>
         </w:tc>
@@ -158,11 +198,43 @@
           <w:tcPr>
             <w:tcW w:w="1470" w:type="dxa"/>
           </w:tcPr>
-          <w:p>
-            <w:r>
-              <w:t>27/03/2026</w:t>
-            </w:r>
-          </w:p>
+          <w:tbl>
+            <w:tblPr>
+              <w:tblW w:w="0" w:type="auto"/>
+              <w:tblCellSpacing w:w="15" w:type="dxa"/>
+              <w:tblCellMar>
+                <w:top w:w="15" w:type="dxa"/>
+                <w:left w:w="15" w:type="dxa"/>
+                <w:bottom w:w="15" w:type="dxa"/>
+                <w:right w:w="15" w:type="dxa"/>
+              </w:tblCellMar>
+              <w:tblLook w:val="04A0" w:firstRow="1" w:lastRow="0" w:firstColumn="1" w:lastColumn="0" w:noHBand="0" w:noVBand="1"/>
+            </w:tblPr>
+            <w:tblGrid>
+              <w:gridCol w:w="1184"/>
+            </w:tblGrid>
+            <w:tr>
+              <w:trPr>
+                <w:tblCellSpacing w:w="15" w:type="dxa"/>
+              </w:trPr>
+              <w:tc>
+                <w:tcPr>
+                  <w:tcW w:w="0" w:type="auto"/>
+                  <w:vAlign w:val="center"/>
+                  <w:hideMark/>
+                </w:tcPr>
+                <w:p>
+                  <w:pPr>
+                    <w:framePr w:hSpace="141" w:wrap="around" w:vAnchor="text" w:hAnchor="margin" w:y="918"/>
+                  </w:pPr>
+                  <w:r>
+                    <w:t>18/03/2026</w:t>
+                  </w:r>
+                </w:p>
+              </w:tc>
+            </w:tr>
+          </w:tbl>
+          <w:p/>
         </w:tc>
         <w:tc>
           <w:tcPr>
@@ -170,19 +242,7 @@
           </w:tcPr>
           <w:p>
             <w:r>
-              <w:t xml:space="preserve">Se añadió al documento </w:t>
-            </w:r>
-            <w:r>
-              <w:t>Diseño</w:t>
-            </w:r>
-            <w:r>
-              <w:t xml:space="preserve"> del sistema</w:t>
-            </w:r>
-            <w:r>
-              <w:t xml:space="preserve"> (Actividad 3)</w:t>
-            </w:r>
-            <w:r>
-              <w:t xml:space="preserve"> a la rama de actividades en la carpeta de /ENTREGAS y además se añadió a la carpeta de /EVIDENCIAS en formato.io el diagrama de flujo de información. </w:t>
+              <w:t>Se actualizó el documento del proyecto, realizando ajustes en la información registrada para los entregables.</w:t>
             </w:r>
           </w:p>
         </w:tc>
@@ -192,7 +252,7 @@
           </w:tcPr>
           <w:p>
             <w:r>
-              <w:t>Luis C.</w:t>
+              <w:t>Salomé A.</w:t>
             </w:r>
           </w:p>
         </w:tc>
@@ -212,11 +272,43 @@
           <w:tcPr>
             <w:tcW w:w="1470" w:type="dxa"/>
           </w:tcPr>
-          <w:p>
-            <w:r>
-              <w:t>27/05/2026</w:t>
-            </w:r>
-          </w:p>
+          <w:tbl>
+            <w:tblPr>
+              <w:tblW w:w="0" w:type="auto"/>
+              <w:tblCellSpacing w:w="15" w:type="dxa"/>
+              <w:tblCellMar>
+                <w:top w:w="15" w:type="dxa"/>
+                <w:left w:w="15" w:type="dxa"/>
+                <w:bottom w:w="15" w:type="dxa"/>
+                <w:right w:w="15" w:type="dxa"/>
+              </w:tblCellMar>
+              <w:tblLook w:val="04A0" w:firstRow="1" w:lastRow="0" w:firstColumn="1" w:lastColumn="0" w:noHBand="0" w:noVBand="1"/>
+            </w:tblPr>
+            <w:tblGrid>
+              <w:gridCol w:w="1184"/>
+            </w:tblGrid>
+            <w:tr>
+              <w:trPr>
+                <w:tblCellSpacing w:w="15" w:type="dxa"/>
+              </w:trPr>
+              <w:tc>
+                <w:tcPr>
+                  <w:tcW w:w="0" w:type="auto"/>
+                  <w:vAlign w:val="center"/>
+                  <w:hideMark/>
+                </w:tcPr>
+                <w:p>
+                  <w:pPr>
+                    <w:framePr w:hSpace="141" w:wrap="around" w:vAnchor="text" w:hAnchor="margin" w:y="918"/>
+                  </w:pPr>
+                  <w:r>
+                    <w:t>18/03/2026</w:t>
+                  </w:r>
+                </w:p>
+              </w:tc>
+            </w:tr>
+          </w:tbl>
+          <w:p/>
         </w:tc>
         <w:tc>
           <w:tcPr>
@@ -224,7 +316,7 @@
           </w:tcPr>
           <w:p>
             <w:r>
-              <w:t>Se añadió el documento que contiene los diferentes tipos de pruebas en la carpeta de /ENTREGAS</w:t>
+              <w:t>Se realizó una nueva actualización del documento, complementando la información del avance del proyecto.</w:t>
             </w:r>
           </w:p>
         </w:tc>
@@ -234,7 +326,7 @@
           </w:tcPr>
           <w:p>
             <w:r>
-              <w:t>Salome A.</w:t>
+              <w:t>Salomé A.</w:t>
             </w:r>
           </w:p>
         </w:tc>
@@ -249,7 +341,263 @@
               <w:t>3</w:t>
             </w:r>
           </w:p>
-          <w:p/>
+        </w:tc>
+        <w:tc>
+          <w:tcPr>
+            <w:tcW w:w="1470" w:type="dxa"/>
+          </w:tcPr>
+          <w:p>
+            <w:r>
+              <w:t>20/03/2026</w:t>
+            </w:r>
+          </w:p>
+        </w:tc>
+        <w:tc>
+          <w:tcPr>
+            <w:tcW w:w="4379" w:type="dxa"/>
+          </w:tcPr>
+          <w:p>
+            <w:r>
+              <w:t>Se añadió el modelo de entrevista en la carpeta de EVIDENCIAS como soporte para la recolección de información del proyecto</w:t>
+            </w:r>
+          </w:p>
+        </w:tc>
+        <w:tc>
+          <w:tcPr>
+            <w:tcW w:w="2186" w:type="dxa"/>
+          </w:tcPr>
+          <w:p>
+            <w:r>
+              <w:t>Salomé A.</w:t>
+            </w:r>
+          </w:p>
+        </w:tc>
+      </w:tr>
+      <w:tr>
+        <w:tc>
+          <w:tcPr>
+            <w:tcW w:w="793" w:type="dxa"/>
+          </w:tcPr>
+          <w:p>
+            <w:r>
+              <w:t>4</w:t>
+            </w:r>
+          </w:p>
+        </w:tc>
+        <w:tc>
+          <w:tcPr>
+            <w:tcW w:w="1470" w:type="dxa"/>
+          </w:tcPr>
+          <w:p>
+            <w:r>
+              <w:t>23/03/2026</w:t>
+            </w:r>
+          </w:p>
+        </w:tc>
+        <w:tc>
+          <w:tcPr>
+            <w:tcW w:w="4379" w:type="dxa"/>
+          </w:tcPr>
+          <w:p>
+            <w:r>
+              <w:t>Se añadió el documento Diseño del sistema a la rama de Actividades en la carpeta de /ENTREGAS y además se añadió a la carpeta de /EVIDENCIAS en formato .png el diagrama de despliegue</w:t>
+            </w:r>
+          </w:p>
+        </w:tc>
+        <w:tc>
+          <w:tcPr>
+            <w:tcW w:w="2186" w:type="dxa"/>
+          </w:tcPr>
+          <w:p>
+            <w:proofErr w:type="spellStart"/>
+            <w:r>
+              <w:t>Duvan</w:t>
+            </w:r>
+            <w:proofErr w:type="spellEnd"/>
+            <w:r>
+              <w:t xml:space="preserve"> A.</w:t>
+            </w:r>
+          </w:p>
+        </w:tc>
+      </w:tr>
+      <w:tr>
+        <w:tc>
+          <w:tcPr>
+            <w:tcW w:w="793" w:type="dxa"/>
+          </w:tcPr>
+          <w:p>
+            <w:r>
+              <w:t>5</w:t>
+            </w:r>
+          </w:p>
+        </w:tc>
+        <w:tc>
+          <w:tcPr>
+            <w:tcW w:w="1470" w:type="dxa"/>
+          </w:tcPr>
+          <w:p>
+            <w:r>
+              <w:t>27/03/2026</w:t>
+            </w:r>
+          </w:p>
+        </w:tc>
+        <w:tc>
+          <w:tcPr>
+            <w:tcW w:w="4379" w:type="dxa"/>
+          </w:tcPr>
+          <w:p>
+            <w:r>
+              <w:t xml:space="preserve">Se añadió al documento Diseño del sistema (Actividad 3) a la rama de actividades en la carpeta de /ENTREGAS y además se añadió a la carpeta de /EVIDENCIAS en formato.io el diagrama de flujo de información. </w:t>
+            </w:r>
+          </w:p>
+        </w:tc>
+        <w:tc>
+          <w:tcPr>
+            <w:tcW w:w="2186" w:type="dxa"/>
+          </w:tcPr>
+          <w:p>
+            <w:r>
+              <w:t>Luis C.</w:t>
+            </w:r>
+          </w:p>
+        </w:tc>
+      </w:tr>
+      <w:tr>
+        <w:tc>
+          <w:tcPr>
+            <w:tcW w:w="793" w:type="dxa"/>
+          </w:tcPr>
+          <w:p>
+            <w:r>
+              <w:t>6</w:t>
+            </w:r>
+          </w:p>
+        </w:tc>
+        <w:tc>
+          <w:tcPr>
+            <w:tcW w:w="1470" w:type="dxa"/>
+          </w:tcPr>
+          <w:p>
+            <w:r>
+              <w:t>08/04/2026</w:t>
+            </w:r>
+          </w:p>
+        </w:tc>
+        <w:tc>
+          <w:tcPr>
+            <w:tcW w:w="4379" w:type="dxa"/>
+          </w:tcPr>
+          <w:p>
+            <w:r>
+              <w:t>Se actualizó la Actividad 3 del proyecto, incorporando ajustes relacionados con el desarrollo del sistema</w:t>
+            </w:r>
+          </w:p>
+        </w:tc>
+        <w:tc>
+          <w:tcPr>
+            <w:tcW w:w="2186" w:type="dxa"/>
+          </w:tcPr>
+          <w:p>
+            <w:r>
+              <w:t>Salomé A.</w:t>
+            </w:r>
+          </w:p>
+        </w:tc>
+      </w:tr>
+      <w:tr>
+        <w:tc>
+          <w:tcPr>
+            <w:tcW w:w="793" w:type="dxa"/>
+          </w:tcPr>
+          <w:p>
+            <w:r>
+              <w:t>7</w:t>
+            </w:r>
+          </w:p>
+        </w:tc>
+        <w:tc>
+          <w:tcPr>
+            <w:tcW w:w="1470" w:type="dxa"/>
+          </w:tcPr>
+          <w:p>
+            <w:r>
+              <w:t>08/04/2026</w:t>
+            </w:r>
+          </w:p>
+        </w:tc>
+        <w:tc>
+          <w:tcPr>
+            <w:tcW w:w="4379" w:type="dxa"/>
+          </w:tcPr>
+          <w:p>
+            <w:r>
+              <w:t>Se actualizó el documento en Word correspondiente a la Actividad 3 del proyecto</w:t>
+            </w:r>
+          </w:p>
+        </w:tc>
+        <w:tc>
+          <w:tcPr>
+            <w:tcW w:w="2186" w:type="dxa"/>
+          </w:tcPr>
+          <w:p>
+            <w:r>
+              <w:t>Salomé A.</w:t>
+            </w:r>
+          </w:p>
+        </w:tc>
+      </w:tr>
+      <w:tr>
+        <w:tc>
+          <w:tcPr>
+            <w:tcW w:w="793" w:type="dxa"/>
+          </w:tcPr>
+          <w:p>
+            <w:r>
+              <w:t>8</w:t>
+            </w:r>
+          </w:p>
+        </w:tc>
+        <w:tc>
+          <w:tcPr>
+            <w:tcW w:w="1470" w:type="dxa"/>
+          </w:tcPr>
+          <w:p>
+            <w:r>
+              <w:t>27/05/2026</w:t>
+            </w:r>
+          </w:p>
+        </w:tc>
+        <w:tc>
+          <w:tcPr>
+            <w:tcW w:w="4379" w:type="dxa"/>
+          </w:tcPr>
+          <w:p>
+            <w:r>
+              <w:t>Se añadió el documento que contiene los diferentes tipos de pruebas en la carpeta de /ENTREGAS</w:t>
+            </w:r>
+          </w:p>
+        </w:tc>
+        <w:tc>
+          <w:tcPr>
+            <w:tcW w:w="2186" w:type="dxa"/>
+          </w:tcPr>
+          <w:p>
+            <w:r>
+              <w:t>Salomé A.</w:t>
+            </w:r>
+          </w:p>
+        </w:tc>
+      </w:tr>
+      <w:tr>
+        <w:tc>
+          <w:tcPr>
+            <w:tcW w:w="793" w:type="dxa"/>
+          </w:tcPr>
+          <w:p>
+            <w:r>
+              <w:t>9</w:t>
+            </w:r>
+          </w:p>
         </w:tc>
         <w:tc>
           <w:tcPr>
@@ -318,6 +666,7 @@
           </w:p>
           <w:p>
             <w:r>
+              <w:lastRenderedPageBreak/>
               <w:t xml:space="preserve"> </w:t>
             </w:r>
           </w:p>
@@ -327,8 +676,14 @@
             <w:tcW w:w="2186" w:type="dxa"/>
           </w:tcPr>
           <w:p>
-            <w:r>
-              <w:t>Duvan A.</w:t>
+            <w:proofErr w:type="spellStart"/>
+            <w:r>
+              <w:lastRenderedPageBreak/>
+              <w:t>Duvan</w:t>
+            </w:r>
+            <w:proofErr w:type="spellEnd"/>
+            <w:r>
+              <w:t xml:space="preserve"> A.</w:t>
             </w:r>
           </w:p>
         </w:tc>
@@ -340,7 +695,7 @@
           </w:tcPr>
           <w:p>
             <w:r>
-              <w:t>4</w:t>
+              <w:t>10</w:t>
             </w:r>
           </w:p>
         </w:tc>
@@ -372,7 +727,15 @@
             </w:r>
             <w:r>
               <w:br/>
-              <w:t>Además se modifico el arranque del proyecto para que fuese mucho más fácil de iniciar con el script start.bat</w:t>
+              <w:t xml:space="preserve">Además se </w:t>
+            </w:r>
+            <w:proofErr w:type="spellStart"/>
+            <w:r>
+              <w:t>modifico</w:t>
+            </w:r>
+            <w:proofErr w:type="spellEnd"/>
+            <w:r>
+              <w:t xml:space="preserve"> el arranque del proyecto para que fuese mucho más fácil de iniciar con el script start.bat</w:t>
             </w:r>
           </w:p>
         </w:tc>
@@ -381,8 +744,13 @@
             <w:tcW w:w="2186" w:type="dxa"/>
           </w:tcPr>
           <w:p>
-            <w:r>
-              <w:t>Duvan A.</w:t>
+            <w:proofErr w:type="spellStart"/>
+            <w:r>
+              <w:t>Duvan</w:t>
+            </w:r>
+            <w:proofErr w:type="spellEnd"/>
+            <w:r>
+              <w:t xml:space="preserve"> A.</w:t>
             </w:r>
           </w:p>
         </w:tc>
@@ -394,7 +762,7 @@
           </w:tcPr>
           <w:p>
             <w:r>
-              <w:t xml:space="preserve">5 </w:t>
+              <w:t>11</w:t>
             </w:r>
           </w:p>
         </w:tc>
@@ -414,7 +782,15 @@
           </w:tcPr>
           <w:p>
             <w:r>
-              <w:t>Se añadieron validaciones en el apartado de cotizaciones para que no se permitirá registrar una cotización si la cantidad que s desea guardar es mayor a la cantidad disponible en stock.</w:t>
+              <w:t xml:space="preserve">Se añadieron validaciones en el apartado de cotizaciones para que no se permitirá registrar una cotización si la cantidad que </w:t>
+            </w:r>
+            <w:proofErr w:type="spellStart"/>
+            <w:r>
+              <w:t>s</w:t>
+            </w:r>
+            <w:proofErr w:type="spellEnd"/>
+            <w:r>
+              <w:t xml:space="preserve"> desea guardar es mayor a la cantidad disponible en stock.</w:t>
             </w:r>
           </w:p>
         </w:tc>
@@ -423,8 +799,13 @@
             <w:tcW w:w="2186" w:type="dxa"/>
           </w:tcPr>
           <w:p>
-            <w:r>
-              <w:t>Duvan A.</w:t>
+            <w:proofErr w:type="spellStart"/>
+            <w:r>
+              <w:t>Duvan</w:t>
+            </w:r>
+            <w:proofErr w:type="spellEnd"/>
+            <w:r>
+              <w:t xml:space="preserve"> A.</w:t>
             </w:r>
           </w:p>
         </w:tc>
@@ -580,6 +961,17 @@
         <w:t>LISTA DE CAMBIOS.</w:t>
       </w:r>
     </w:p>
+    <w:p>
+      <w:pPr>
+        <w:jc w:val="center"/>
+        <w:rPr>
+          <w:b/>
+          <w:bCs/>
+          <w:i/>
+          <w:iCs/>
+        </w:rPr>
+      </w:pPr>
+    </w:p>
     <w:sectPr>
       <w:pgSz w:w="12240" w:h="15840"/>
       <w:pgMar w:top="1417" w:right="1701" w:bottom="1417" w:left="1701" w:header="708" w:footer="708" w:gutter="0"/>
@@ -591,7 +983,7 @@
 </file>
 
 <file path=word/styles.xml><?xml version="1.0" encoding="utf-8"?>
-<w:styles xmlns:mc="http://schemas.openxmlformats.org/markup-compatibility/2006" xmlns:r="http://schemas.openxmlformats.org/officeDocument/2006/relationships" xmlns:w="http://schemas.openxmlformats.org/wordprocessingml/2006/main" xmlns:w14="http://schemas.microsoft.com/office/word/2010/wordml" xmlns:w15="http://schemas.microsoft.com/office/word/2012/wordml" xmlns:w16cex="http://schemas.microsoft.com/office/word/2018/wordml/cex" xmlns:w16cid="http://schemas.microsoft.com/office/word/2016/wordml/cid" xmlns:w16="http://schemas.microsoft.com/office/word/2018/wordml" xmlns:w16sdtdh="http://schemas.microsoft.com/office/word/2020/wordml/sdtdatahash" xmlns:w16se="http://schemas.microsoft.com/office/word/2015/wordml/symex" mc:Ignorable="w14 w15 w16se w16cid w16 w16cex w16sdtdh">
+<w:styles xmlns:mc="http://schemas.openxmlformats.org/markup-compatibility/2006" xmlns:r="http://schemas.openxmlformats.org/officeDocument/2006/relationships" xmlns:w="http://schemas.openxmlformats.org/wordprocessingml/2006/main" xmlns:w14="http://schemas.microsoft.com/office/word/2010/wordml" xmlns:w15="http://schemas.microsoft.com/office/word/2012/wordml" xmlns:w16cex="http://schemas.microsoft.com/office/word/2018/wordml/cex" xmlns:w16cid="http://schemas.microsoft.com/office/word/2016/wordml/cid" xmlns:w16="http://schemas.microsoft.com/office/word/2018/wordml" xmlns:w16du="http://schemas.microsoft.com/office/word/2023/wordml/word16du" xmlns:w16sdtdh="http://schemas.microsoft.com/office/word/2020/wordml/sdtdatahash" xmlns:w16sdtfl="http://schemas.microsoft.com/office/word/2024/wordml/sdtformatlock" xmlns:w16se="http://schemas.microsoft.com/office/word/2015/wordml/symex" mc:Ignorable="w14 w15 w16se w16cid w16 w16cex w16sdtdh w16sdtfl w16du">
   <w:docDefaults>
     <w:rPrDefault>
       <w:rPr>
@@ -991,11 +1383,11 @@
     <w:name w:val="Normal"/>
     <w:qFormat/>
   </w:style>
-  <w:style w:type="paragraph" w:styleId="Ttulo1">
+  <w:style w:type="paragraph" w:styleId="Heading1">
     <w:name w:val="heading 1"/>
     <w:basedOn w:val="Normal"/>
     <w:next w:val="Normal"/>
-    <w:link w:val="Ttulo1Car"/>
+    <w:link w:val="Heading1Char"/>
     <w:uiPriority w:val="9"/>
     <w:qFormat/>
     <w:rsid w:val="00131CF7"/>
@@ -1012,11 +1404,11 @@
       <w:szCs w:val="40"/>
     </w:rPr>
   </w:style>
-  <w:style w:type="paragraph" w:styleId="Ttulo2">
+  <w:style w:type="paragraph" w:styleId="Heading2">
     <w:name w:val="heading 2"/>
     <w:basedOn w:val="Normal"/>
     <w:next w:val="Normal"/>
-    <w:link w:val="Ttulo2Car"/>
+    <w:link w:val="Heading2Char"/>
     <w:uiPriority w:val="9"/>
     <w:semiHidden/>
     <w:unhideWhenUsed/>
@@ -1035,11 +1427,11 @@
       <w:szCs w:val="32"/>
     </w:rPr>
   </w:style>
-  <w:style w:type="paragraph" w:styleId="Ttulo3">
+  <w:style w:type="paragraph" w:styleId="Heading3">
     <w:name w:val="heading 3"/>
     <w:basedOn w:val="Normal"/>
     <w:next w:val="Normal"/>
-    <w:link w:val="Ttulo3Car"/>
+    <w:link w:val="Heading3Char"/>
     <w:uiPriority w:val="9"/>
     <w:semiHidden/>
     <w:unhideWhenUsed/>
@@ -1058,11 +1450,11 @@
       <w:szCs w:val="28"/>
     </w:rPr>
   </w:style>
-  <w:style w:type="paragraph" w:styleId="Ttulo4">
+  <w:style w:type="paragraph" w:styleId="Heading4">
     <w:name w:val="heading 4"/>
     <w:basedOn w:val="Normal"/>
     <w:next w:val="Normal"/>
-    <w:link w:val="Ttulo4Car"/>
+    <w:link w:val="Heading4Char"/>
     <w:uiPriority w:val="9"/>
     <w:semiHidden/>
     <w:unhideWhenUsed/>
@@ -1081,11 +1473,11 @@
       <w:color w:val="0F4761" w:themeColor="accent1" w:themeShade="BF"/>
     </w:rPr>
   </w:style>
-  <w:style w:type="paragraph" w:styleId="Ttulo5">
+  <w:style w:type="paragraph" w:styleId="Heading5">
     <w:name w:val="heading 5"/>
     <w:basedOn w:val="Normal"/>
     <w:next w:val="Normal"/>
-    <w:link w:val="Ttulo5Car"/>
+    <w:link w:val="Heading5Char"/>
     <w:uiPriority w:val="9"/>
     <w:semiHidden/>
     <w:unhideWhenUsed/>
@@ -1102,11 +1494,11 @@
       <w:color w:val="0F4761" w:themeColor="accent1" w:themeShade="BF"/>
     </w:rPr>
   </w:style>
-  <w:style w:type="paragraph" w:styleId="Ttulo6">
+  <w:style w:type="paragraph" w:styleId="Heading6">
     <w:name w:val="heading 6"/>
     <w:basedOn w:val="Normal"/>
     <w:next w:val="Normal"/>
-    <w:link w:val="Ttulo6Car"/>
+    <w:link w:val="Heading6Char"/>
     <w:uiPriority w:val="9"/>
     <w:semiHidden/>
     <w:unhideWhenUsed/>
@@ -1125,11 +1517,11 @@
       <w:color w:val="595959" w:themeColor="text1" w:themeTint="A6"/>
     </w:rPr>
   </w:style>
-  <w:style w:type="paragraph" w:styleId="Ttulo7">
+  <w:style w:type="paragraph" w:styleId="Heading7">
     <w:name w:val="heading 7"/>
     <w:basedOn w:val="Normal"/>
     <w:next w:val="Normal"/>
-    <w:link w:val="Ttulo7Car"/>
+    <w:link w:val="Heading7Char"/>
     <w:uiPriority w:val="9"/>
     <w:semiHidden/>
     <w:unhideWhenUsed/>
@@ -1146,11 +1538,11 @@
       <w:color w:val="595959" w:themeColor="text1" w:themeTint="A6"/>
     </w:rPr>
   </w:style>
-  <w:style w:type="paragraph" w:styleId="Ttulo8">
+  <w:style w:type="paragraph" w:styleId="Heading8">
     <w:name w:val="heading 8"/>
     <w:basedOn w:val="Normal"/>
     <w:next w:val="Normal"/>
-    <w:link w:val="Ttulo8Car"/>
+    <w:link w:val="Heading8Char"/>
     <w:uiPriority w:val="9"/>
     <w:semiHidden/>
     <w:unhideWhenUsed/>
@@ -1168,11 +1560,11 @@
       <w:color w:val="272727" w:themeColor="text1" w:themeTint="D8"/>
     </w:rPr>
   </w:style>
-  <w:style w:type="paragraph" w:styleId="Ttulo9">
+  <w:style w:type="paragraph" w:styleId="Heading9">
     <w:name w:val="heading 9"/>
     <w:basedOn w:val="Normal"/>
     <w:next w:val="Normal"/>
-    <w:link w:val="Ttulo9Car"/>
+    <w:link w:val="Heading9Char"/>
     <w:uiPriority w:val="9"/>
     <w:semiHidden/>
     <w:unhideWhenUsed/>
@@ -1188,13 +1580,13 @@
       <w:color w:val="272727" w:themeColor="text1" w:themeTint="D8"/>
     </w:rPr>
   </w:style>
-  <w:style w:type="character" w:default="1" w:styleId="Fuentedeprrafopredeter">
+  <w:style w:type="character" w:default="1" w:styleId="DefaultParagraphFont">
     <w:name w:val="Default Paragraph Font"/>
     <w:uiPriority w:val="1"/>
     <w:semiHidden/>
     <w:unhideWhenUsed/>
   </w:style>
-  <w:style w:type="table" w:default="1" w:styleId="Tablanormal">
+  <w:style w:type="table" w:default="1" w:styleId="TableNormal">
     <w:name w:val="Normal Table"/>
     <w:uiPriority w:val="99"/>
     <w:semiHidden/>
@@ -1209,16 +1601,16 @@
       </w:tblCellMar>
     </w:tblPr>
   </w:style>
-  <w:style w:type="numbering" w:default="1" w:styleId="Sinlista">
+  <w:style w:type="numbering" w:default="1" w:styleId="NoList">
     <w:name w:val="No List"/>
     <w:uiPriority w:val="99"/>
     <w:semiHidden/>
     <w:unhideWhenUsed/>
   </w:style>
-  <w:style w:type="character" w:customStyle="1" w:styleId="Ttulo1Car">
-    <w:name w:val="Título 1 Car"/>
-    <w:basedOn w:val="Fuentedeprrafopredeter"/>
-    <w:link w:val="Ttulo1"/>
+  <w:style w:type="character" w:customStyle="1" w:styleId="Heading1Char">
+    <w:name w:val="Heading 1 Char"/>
+    <w:basedOn w:val="DefaultParagraphFont"/>
+    <w:link w:val="Heading1"/>
     <w:uiPriority w:val="9"/>
     <w:rsid w:val="00131CF7"/>
     <w:rPr>
@@ -1228,10 +1620,10 @@
       <w:szCs w:val="40"/>
     </w:rPr>
   </w:style>
-  <w:style w:type="character" w:customStyle="1" w:styleId="Ttulo2Car">
-    <w:name w:val="Título 2 Car"/>
-    <w:basedOn w:val="Fuentedeprrafopredeter"/>
-    <w:link w:val="Ttulo2"/>
+  <w:style w:type="character" w:customStyle="1" w:styleId="Heading2Char">
+    <w:name w:val="Heading 2 Char"/>
+    <w:basedOn w:val="DefaultParagraphFont"/>
+    <w:link w:val="Heading2"/>
     <w:uiPriority w:val="9"/>
     <w:semiHidden/>
     <w:rsid w:val="00131CF7"/>
@@ -1242,10 +1634,10 @@
       <w:szCs w:val="32"/>
     </w:rPr>
   </w:style>
-  <w:style w:type="character" w:customStyle="1" w:styleId="Ttulo3Car">
-    <w:name w:val="Título 3 Car"/>
-    <w:basedOn w:val="Fuentedeprrafopredeter"/>
-    <w:link w:val="Ttulo3"/>
+  <w:style w:type="character" w:customStyle="1" w:styleId="Heading3Char">
+    <w:name w:val="Heading 3 Char"/>
+    <w:basedOn w:val="DefaultParagraphFont"/>
+    <w:link w:val="Heading3"/>
     <w:uiPriority w:val="9"/>
     <w:semiHidden/>
     <w:rsid w:val="00131CF7"/>
@@ -1256,10 +1648,10 @@
       <w:szCs w:val="28"/>
     </w:rPr>
   </w:style>
-  <w:style w:type="character" w:customStyle="1" w:styleId="Ttulo4Car">
-    <w:name w:val="Título 4 Car"/>
-    <w:basedOn w:val="Fuentedeprrafopredeter"/>
-    <w:link w:val="Ttulo4"/>
+  <w:style w:type="character" w:customStyle="1" w:styleId="Heading4Char">
+    <w:name w:val="Heading 4 Char"/>
+    <w:basedOn w:val="DefaultParagraphFont"/>
+    <w:link w:val="Heading4"/>
     <w:uiPriority w:val="9"/>
     <w:semiHidden/>
     <w:rsid w:val="00131CF7"/>
@@ -1270,10 +1662,10 @@
       <w:color w:val="0F4761" w:themeColor="accent1" w:themeShade="BF"/>
     </w:rPr>
   </w:style>
-  <w:style w:type="character" w:customStyle="1" w:styleId="Ttulo5Car">
-    <w:name w:val="Título 5 Car"/>
-    <w:basedOn w:val="Fuentedeprrafopredeter"/>
-    <w:link w:val="Ttulo5"/>
+  <w:style w:type="character" w:customStyle="1" w:styleId="Heading5Char">
+    <w:name w:val="Heading 5 Char"/>
+    <w:basedOn w:val="DefaultParagraphFont"/>
+    <w:link w:val="Heading5"/>
     <w:uiPriority w:val="9"/>
     <w:semiHidden/>
     <w:rsid w:val="00131CF7"/>
@@ -1282,10 +1674,10 @@
       <w:color w:val="0F4761" w:themeColor="accent1" w:themeShade="BF"/>
     </w:rPr>
   </w:style>
-  <w:style w:type="character" w:customStyle="1" w:styleId="Ttulo6Car">
-    <w:name w:val="Título 6 Car"/>
-    <w:basedOn w:val="Fuentedeprrafopredeter"/>
-    <w:link w:val="Ttulo6"/>
+  <w:style w:type="character" w:customStyle="1" w:styleId="Heading6Char">
+    <w:name w:val="Heading 6 Char"/>
+    <w:basedOn w:val="DefaultParagraphFont"/>
+    <w:link w:val="Heading6"/>
     <w:uiPriority w:val="9"/>
     <w:semiHidden/>
     <w:rsid w:val="00131CF7"/>
@@ -1296,10 +1688,10 @@
       <w:color w:val="595959" w:themeColor="text1" w:themeTint="A6"/>
     </w:rPr>
   </w:style>
-  <w:style w:type="character" w:customStyle="1" w:styleId="Ttulo7Car">
-    <w:name w:val="Título 7 Car"/>
-    <w:basedOn w:val="Fuentedeprrafopredeter"/>
-    <w:link w:val="Ttulo7"/>
+  <w:style w:type="character" w:customStyle="1" w:styleId="Heading7Char">
+    <w:name w:val="Heading 7 Char"/>
+    <w:basedOn w:val="DefaultParagraphFont"/>
+    <w:link w:val="Heading7"/>
     <w:uiPriority w:val="9"/>
     <w:semiHidden/>
     <w:rsid w:val="00131CF7"/>
@@ -1308,10 +1700,10 @@
       <w:color w:val="595959" w:themeColor="text1" w:themeTint="A6"/>
     </w:rPr>
   </w:style>
-  <w:style w:type="character" w:customStyle="1" w:styleId="Ttulo8Car">
-    <w:name w:val="Título 8 Car"/>
-    <w:basedOn w:val="Fuentedeprrafopredeter"/>
-    <w:link w:val="Ttulo8"/>
+  <w:style w:type="character" w:customStyle="1" w:styleId="Heading8Char">
+    <w:name w:val="Heading 8 Char"/>
+    <w:basedOn w:val="DefaultParagraphFont"/>
+    <w:link w:val="Heading8"/>
     <w:uiPriority w:val="9"/>
     <w:semiHidden/>
     <w:rsid w:val="00131CF7"/>
@@ -1322,10 +1714,10 @@
       <w:color w:val="272727" w:themeColor="text1" w:themeTint="D8"/>
     </w:rPr>
   </w:style>
-  <w:style w:type="character" w:customStyle="1" w:styleId="Ttulo9Car">
-    <w:name w:val="Título 9 Car"/>
-    <w:basedOn w:val="Fuentedeprrafopredeter"/>
-    <w:link w:val="Ttulo9"/>
+  <w:style w:type="character" w:customStyle="1" w:styleId="Heading9Char">
+    <w:name w:val="Heading 9 Char"/>
+    <w:basedOn w:val="DefaultParagraphFont"/>
+    <w:link w:val="Heading9"/>
     <w:uiPriority w:val="9"/>
     <w:semiHidden/>
     <w:rsid w:val="00131CF7"/>
@@ -1334,11 +1726,11 @@
       <w:color w:val="272727" w:themeColor="text1" w:themeTint="D8"/>
     </w:rPr>
   </w:style>
-  <w:style w:type="paragraph" w:styleId="Ttulo">
+  <w:style w:type="paragraph" w:styleId="Title">
     <w:name w:val="Title"/>
     <w:basedOn w:val="Normal"/>
     <w:next w:val="Normal"/>
-    <w:link w:val="TtuloCar"/>
+    <w:link w:val="TitleChar"/>
     <w:uiPriority w:val="10"/>
     <w:qFormat/>
     <w:rsid w:val="00131CF7"/>
@@ -1354,10 +1746,10 @@
       <w:szCs w:val="56"/>
     </w:rPr>
   </w:style>
-  <w:style w:type="character" w:customStyle="1" w:styleId="TtuloCar">
-    <w:name w:val="Título Car"/>
-    <w:basedOn w:val="Fuentedeprrafopredeter"/>
-    <w:link w:val="Ttulo"/>
+  <w:style w:type="character" w:customStyle="1" w:styleId="TitleChar">
+    <w:name w:val="Title Char"/>
+    <w:basedOn w:val="DefaultParagraphFont"/>
+    <w:link w:val="Title"/>
     <w:uiPriority w:val="10"/>
     <w:rsid w:val="00131CF7"/>
     <w:rPr>
@@ -1368,11 +1760,11 @@
       <w:szCs w:val="56"/>
     </w:rPr>
   </w:style>
-  <w:style w:type="paragraph" w:styleId="Subttulo">
+  <w:style w:type="paragraph" w:styleId="Subtitle">
     <w:name w:val="Subtitle"/>
     <w:basedOn w:val="Normal"/>
     <w:next w:val="Normal"/>
-    <w:link w:val="SubttuloCar"/>
+    <w:link w:val="SubtitleChar"/>
     <w:uiPriority w:val="11"/>
     <w:qFormat/>
     <w:rsid w:val="00131CF7"/>
@@ -1389,10 +1781,10 @@
       <w:szCs w:val="28"/>
     </w:rPr>
   </w:style>
-  <w:style w:type="character" w:customStyle="1" w:styleId="SubttuloCar">
-    <w:name w:val="Subtítulo Car"/>
-    <w:basedOn w:val="Fuentedeprrafopredeter"/>
-    <w:link w:val="Subttulo"/>
+  <w:style w:type="character" w:customStyle="1" w:styleId="SubtitleChar">
+    <w:name w:val="Subtitle Char"/>
+    <w:basedOn w:val="DefaultParagraphFont"/>
+    <w:link w:val="Subtitle"/>
     <w:uiPriority w:val="11"/>
     <w:rsid w:val="00131CF7"/>
     <w:rPr>
@@ -1403,11 +1795,11 @@
       <w:szCs w:val="28"/>
     </w:rPr>
   </w:style>
-  <w:style w:type="paragraph" w:styleId="Cita">
+  <w:style w:type="paragraph" w:styleId="Quote">
     <w:name w:val="Quote"/>
     <w:basedOn w:val="Normal"/>
     <w:next w:val="Normal"/>
-    <w:link w:val="CitaCar"/>
+    <w:link w:val="QuoteChar"/>
     <w:uiPriority w:val="29"/>
     <w:qFormat/>
     <w:rsid w:val="00131CF7"/>
@@ -1421,10 +1813,10 @@
       <w:color w:val="404040" w:themeColor="text1" w:themeTint="BF"/>
     </w:rPr>
   </w:style>
-  <w:style w:type="character" w:customStyle="1" w:styleId="CitaCar">
-    <w:name w:val="Cita Car"/>
-    <w:basedOn w:val="Fuentedeprrafopredeter"/>
-    <w:link w:val="Cita"/>
+  <w:style w:type="character" w:customStyle="1" w:styleId="QuoteChar">
+    <w:name w:val="Quote Char"/>
+    <w:basedOn w:val="DefaultParagraphFont"/>
+    <w:link w:val="Quote"/>
     <w:uiPriority w:val="29"/>
     <w:rsid w:val="00131CF7"/>
     <w:rPr>
@@ -1433,7 +1825,7 @@
       <w:color w:val="404040" w:themeColor="text1" w:themeTint="BF"/>
     </w:rPr>
   </w:style>
-  <w:style w:type="paragraph" w:styleId="Prrafodelista">
+  <w:style w:type="paragraph" w:styleId="ListParagraph">
     <w:name w:val="List Paragraph"/>
     <w:basedOn w:val="Normal"/>
     <w:uiPriority w:val="34"/>
@@ -1444,9 +1836,9 @@
       <w:contextualSpacing/>
     </w:pPr>
   </w:style>
-  <w:style w:type="character" w:styleId="nfasisintenso">
+  <w:style w:type="character" w:styleId="IntenseEmphasis">
     <w:name w:val="Intense Emphasis"/>
-    <w:basedOn w:val="Fuentedeprrafopredeter"/>
+    <w:basedOn w:val="DefaultParagraphFont"/>
     <w:uiPriority w:val="21"/>
     <w:qFormat/>
     <w:rsid w:val="00131CF7"/>
@@ -1456,11 +1848,11 @@
       <w:color w:val="0F4761" w:themeColor="accent1" w:themeShade="BF"/>
     </w:rPr>
   </w:style>
-  <w:style w:type="paragraph" w:styleId="Citadestacada">
+  <w:style w:type="paragraph" w:styleId="IntenseQuote">
     <w:name w:val="Intense Quote"/>
     <w:basedOn w:val="Normal"/>
     <w:next w:val="Normal"/>
-    <w:link w:val="CitadestacadaCar"/>
+    <w:link w:val="IntenseQuoteChar"/>
     <w:uiPriority w:val="30"/>
     <w:qFormat/>
     <w:rsid w:val="00131CF7"/>
@@ -1479,10 +1871,10 @@
       <w:color w:val="0F4761" w:themeColor="accent1" w:themeShade="BF"/>
     </w:rPr>
   </w:style>
-  <w:style w:type="character" w:customStyle="1" w:styleId="CitadestacadaCar">
-    <w:name w:val="Cita destacada Car"/>
-    <w:basedOn w:val="Fuentedeprrafopredeter"/>
-    <w:link w:val="Citadestacada"/>
+  <w:style w:type="character" w:customStyle="1" w:styleId="IntenseQuoteChar">
+    <w:name w:val="Intense Quote Char"/>
+    <w:basedOn w:val="DefaultParagraphFont"/>
+    <w:link w:val="IntenseQuote"/>
     <w:uiPriority w:val="30"/>
     <w:rsid w:val="00131CF7"/>
     <w:rPr>
@@ -1491,9 +1883,9 @@
       <w:color w:val="0F4761" w:themeColor="accent1" w:themeShade="BF"/>
     </w:rPr>
   </w:style>
-  <w:style w:type="character" w:styleId="Referenciaintensa">
+  <w:style w:type="character" w:styleId="IntenseReference">
     <w:name w:val="Intense Reference"/>
-    <w:basedOn w:val="Fuentedeprrafopredeter"/>
+    <w:basedOn w:val="DefaultParagraphFont"/>
     <w:uiPriority w:val="32"/>
     <w:qFormat/>
     <w:rsid w:val="00131CF7"/>
@@ -1505,9 +1897,9 @@
       <w:spacing w:val="5"/>
     </w:rPr>
   </w:style>
-  <w:style w:type="table" w:styleId="Tablaconcuadrcula">
+  <w:style w:type="table" w:styleId="TableGrid">
     <w:name w:val="Table Grid"/>
-    <w:basedOn w:val="Tablanormal"/>
+    <w:basedOn w:val="TableNormal"/>
     <w:uiPriority w:val="39"/>
     <w:rsid w:val="00131CF7"/>
     <w:pPr>

</xml_diff>

<commit_message>
Realizacion de pruebas completada
</commit_message>
<xml_diff>
--- a/docs/gestion/LIsta-de-cambios.docx
+++ b/docs/gestion/LIsta-de-cambios.docx
@@ -1,10 +1,10 @@
 
 <file path=word/document.xml><?xml version="1.0" encoding="utf-8"?>
-<w:document xmlns:wpc="http://schemas.microsoft.com/office/word/2010/wordprocessingCanvas" xmlns:cx="http://schemas.microsoft.com/office/drawing/2014/chartex" xmlns:cx1="http://schemas.microsoft.com/office/drawing/2015/9/8/chartex" xmlns:cx2="http://schemas.microsoft.com/office/drawing/2015/10/21/chartex" xmlns:cx3="http://schemas.microsoft.com/office/drawing/2016/5/9/chartex" xmlns:cx4="http://schemas.microsoft.com/office/drawing/2016/5/10/chartex" xmlns:cx5="http://schemas.microsoft.com/office/drawing/2016/5/11/chartex" xmlns:cx6="http://schemas.microsoft.com/office/drawing/2016/5/12/chartex" xmlns:cx7="http://schemas.microsoft.com/office/drawing/2016/5/13/chartex" xmlns:cx8="http://schemas.microsoft.com/office/drawing/2016/5/14/chartex" xmlns:mc="http://schemas.openxmlformats.org/markup-compatibility/2006" xmlns:aink="http://schemas.microsoft.com/office/drawing/2016/ink" xmlns:am3d="http://schemas.microsoft.com/office/drawing/2017/model3d" xmlns:o="urn:schemas-microsoft-com:office:office" xmlns:oel="http://schemas.microsoft.com/office/2019/extlst" xmlns:r="http://schemas.openxmlformats.org/officeDocument/2006/relationships" xmlns:m="http://schemas.openxmlformats.org/officeDocument/2006/math" xmlns:v="urn:schemas-microsoft-com:vml" xmlns:wp14="http://schemas.microsoft.com/office/word/2010/wordprocessingDrawing" xmlns:wp="http://schemas.openxmlformats.org/drawingml/2006/wordprocessingDrawing" xmlns:w10="urn:schemas-microsoft-com:office:word" xmlns:w="http://schemas.openxmlformats.org/wordprocessingml/2006/main" xmlns:w14="http://schemas.microsoft.com/office/word/2010/wordml" xmlns:w15="http://schemas.microsoft.com/office/word/2012/wordml" xmlns:w16cex="http://schemas.microsoft.com/office/word/2018/wordml/cex" xmlns:w16cid="http://schemas.microsoft.com/office/word/2016/wordml/cid" xmlns:w16="http://schemas.microsoft.com/office/word/2018/wordml" xmlns:w16du="http://schemas.microsoft.com/office/word/2023/wordml/word16du" xmlns:w16sdtdh="http://schemas.microsoft.com/office/word/2020/wordml/sdtdatahash" xmlns:w16sdtfl="http://schemas.microsoft.com/office/word/2024/wordml/sdtformatlock" xmlns:w16se="http://schemas.microsoft.com/office/word/2015/wordml/symex" xmlns:wpg="http://schemas.microsoft.com/office/word/2010/wordprocessingGroup" xmlns:wpi="http://schemas.microsoft.com/office/word/2010/wordprocessingInk" xmlns:wne="http://schemas.microsoft.com/office/word/2006/wordml" xmlns:wps="http://schemas.microsoft.com/office/word/2010/wordprocessingShape" mc:Ignorable="w14 w15 w16se w16cid w16 w16cex w16sdtdh w16sdtfl w16du wp14">
+<w:document xmlns:wpc="http://schemas.microsoft.com/office/word/2010/wordprocessingCanvas" xmlns:cx="http://schemas.microsoft.com/office/drawing/2014/chartex" xmlns:cx1="http://schemas.microsoft.com/office/drawing/2015/9/8/chartex" xmlns:cx2="http://schemas.microsoft.com/office/drawing/2015/10/21/chartex" xmlns:cx3="http://schemas.microsoft.com/office/drawing/2016/5/9/chartex" xmlns:cx4="http://schemas.microsoft.com/office/drawing/2016/5/10/chartex" xmlns:cx5="http://schemas.microsoft.com/office/drawing/2016/5/11/chartex" xmlns:cx6="http://schemas.microsoft.com/office/drawing/2016/5/12/chartex" xmlns:cx7="http://schemas.microsoft.com/office/drawing/2016/5/13/chartex" xmlns:cx8="http://schemas.microsoft.com/office/drawing/2016/5/14/chartex" xmlns:mc="http://schemas.openxmlformats.org/markup-compatibility/2006" xmlns:aink="http://schemas.microsoft.com/office/drawing/2016/ink" xmlns:am3d="http://schemas.microsoft.com/office/drawing/2017/model3d" xmlns:o="urn:schemas-microsoft-com:office:office" xmlns:oel="http://schemas.microsoft.com/office/2019/extlst" xmlns:r="http://schemas.openxmlformats.org/officeDocument/2006/relationships" xmlns:m="http://schemas.openxmlformats.org/officeDocument/2006/math" xmlns:v="urn:schemas-microsoft-com:vml" xmlns:wp14="http://schemas.microsoft.com/office/word/2010/wordprocessingDrawing" xmlns:wp="http://schemas.openxmlformats.org/drawingml/2006/wordprocessingDrawing" xmlns:w10="urn:schemas-microsoft-com:office:word" xmlns:w="http://schemas.openxmlformats.org/wordprocessingml/2006/main" xmlns:w14="http://schemas.microsoft.com/office/word/2010/wordml" xmlns:w15="http://schemas.microsoft.com/office/word/2012/wordml" xmlns:w16cex="http://schemas.microsoft.com/office/word/2018/wordml/cex" xmlns:w16cid="http://schemas.microsoft.com/office/word/2016/wordml/cid" xmlns:w16="http://schemas.microsoft.com/office/word/2018/wordml" xmlns:w16sdtdh="http://schemas.microsoft.com/office/word/2020/wordml/sdtdatahash" xmlns:w16se="http://schemas.microsoft.com/office/word/2015/wordml/symex" xmlns:wpg="http://schemas.microsoft.com/office/word/2010/wordprocessingGroup" xmlns:wpi="http://schemas.microsoft.com/office/word/2010/wordprocessingInk" xmlns:wne="http://schemas.microsoft.com/office/word/2006/wordml" xmlns:wps="http://schemas.microsoft.com/office/word/2010/wordprocessingShape" mc:Ignorable="w14 w15 w16se w16cid w16 w16cex w16sdtdh wp14">
   <w:body>
     <w:tbl>
       <w:tblPr>
-        <w:tblStyle w:val="TableGrid"/>
+        <w:tblStyle w:val="Tablaconcuadrcula"/>
         <w:tblpPr w:leftFromText="141" w:rightFromText="141" w:vertAnchor="text" w:horzAnchor="margin" w:tblpY="918"/>
         <w:tblW w:w="0" w:type="auto"/>
         <w:tblLook w:val="04A0" w:firstRow="1" w:lastRow="0" w:firstColumn="1" w:lastColumn="0" w:noHBand="0" w:noVBand="1"/>
@@ -160,15 +160,7 @@
           </w:tcPr>
           <w:p>
             <w:r>
-              <w:t xml:space="preserve">Se añadió el documento correspondiente a la Actividad 1 del proyecto </w:t>
-            </w:r>
-            <w:proofErr w:type="spellStart"/>
-            <w:r>
-              <w:t>Emplanorte</w:t>
-            </w:r>
-            <w:proofErr w:type="spellEnd"/>
-            <w:r>
-              <w:t>.</w:t>
+              <w:t>Se añadió el documento correspondiente a la Actividad 1 del proyecto Emplanorte.</w:t>
             </w:r>
           </w:p>
         </w:tc>
@@ -409,13 +401,8 @@
             <w:tcW w:w="2186" w:type="dxa"/>
           </w:tcPr>
           <w:p>
-            <w:proofErr w:type="spellStart"/>
-            <w:r>
-              <w:t>Duvan</w:t>
-            </w:r>
-            <w:proofErr w:type="spellEnd"/>
-            <w:r>
-              <w:t xml:space="preserve"> A.</w:t>
+            <w:r>
+              <w:t>Duvan A.</w:t>
             </w:r>
           </w:p>
         </w:tc>
@@ -624,15 +611,7 @@
             </w:r>
             <w:r>
               <w:br/>
-              <w:t xml:space="preserve">1. Se añadió gran parte del </w:t>
-            </w:r>
-            <w:proofErr w:type="spellStart"/>
-            <w:r>
-              <w:t>frontend</w:t>
-            </w:r>
-            <w:proofErr w:type="spellEnd"/>
-            <w:r>
-              <w:t>.</w:t>
+              <w:t>1. Se añadió gran parte del frontend.</w:t>
             </w:r>
             <w:r>
               <w:br/>
@@ -640,28 +619,12 @@
             </w:r>
             <w:r>
               <w:br/>
-              <w:t xml:space="preserve">3. Se añadió gran parte del </w:t>
-            </w:r>
-            <w:proofErr w:type="spellStart"/>
-            <w:r>
-              <w:t>backend</w:t>
-            </w:r>
-            <w:proofErr w:type="spellEnd"/>
-            <w:r>
-              <w:t>.</w:t>
-            </w:r>
-          </w:p>
-          <w:p>
-            <w:r>
-              <w:t xml:space="preserve">4. Reestructuración de la arquitectura del </w:t>
-            </w:r>
-            <w:proofErr w:type="spellStart"/>
-            <w:r>
-              <w:t>github</w:t>
-            </w:r>
-            <w:proofErr w:type="spellEnd"/>
-            <w:r>
-              <w:t>.</w:t>
+              <w:t>3. Se añadió gran parte del backend.</w:t>
+            </w:r>
+          </w:p>
+          <w:p>
+            <w:r>
+              <w:t>4. Reestructuración de la arquitectura del github.</w:t>
             </w:r>
           </w:p>
           <w:p>
@@ -676,14 +639,9 @@
             <w:tcW w:w="2186" w:type="dxa"/>
           </w:tcPr>
           <w:p>
-            <w:proofErr w:type="spellStart"/>
             <w:r>
               <w:lastRenderedPageBreak/>
-              <w:t>Duvan</w:t>
-            </w:r>
-            <w:proofErr w:type="spellEnd"/>
-            <w:r>
-              <w:t xml:space="preserve"> A.</w:t>
+              <w:t>Duvan A.</w:t>
             </w:r>
           </w:p>
         </w:tc>
@@ -715,42 +673,21 @@
           </w:tcPr>
           <w:p>
             <w:r>
-              <w:t xml:space="preserve">Se añadió un apartado de estadísticas en la parte del </w:t>
-            </w:r>
-            <w:proofErr w:type="spellStart"/>
-            <w:r>
-              <w:t>frontend</w:t>
-            </w:r>
-            <w:proofErr w:type="spellEnd"/>
-            <w:r>
-              <w:t xml:space="preserve"> para visualizar mucho más fácil las estadísticas de los gastos.</w:t>
+              <w:t>Se añadió un apartado de estadísticas en la parte del frontend para visualizar mucho más fácil las estadísticas de los gastos.</w:t>
             </w:r>
             <w:r>
               <w:br/>
-              <w:t xml:space="preserve">Además se </w:t>
-            </w:r>
-            <w:proofErr w:type="spellStart"/>
-            <w:r>
-              <w:t>modifico</w:t>
-            </w:r>
-            <w:proofErr w:type="spellEnd"/>
-            <w:r>
-              <w:t xml:space="preserve"> el arranque del proyecto para que fuese mucho más fácil de iniciar con el script start.bat</w:t>
-            </w:r>
-          </w:p>
-        </w:tc>
-        <w:tc>
-          <w:tcPr>
-            <w:tcW w:w="2186" w:type="dxa"/>
-          </w:tcPr>
-          <w:p>
-            <w:proofErr w:type="spellStart"/>
-            <w:r>
-              <w:t>Duvan</w:t>
-            </w:r>
-            <w:proofErr w:type="spellEnd"/>
-            <w:r>
-              <w:t xml:space="preserve"> A.</w:t>
+              <w:t>Además se modifico el arranque del proyecto para que fuese mucho más fácil de iniciar con el script start.bat</w:t>
+            </w:r>
+          </w:p>
+        </w:tc>
+        <w:tc>
+          <w:tcPr>
+            <w:tcW w:w="2186" w:type="dxa"/>
+          </w:tcPr>
+          <w:p>
+            <w:r>
+              <w:t>Duvan A.</w:t>
             </w:r>
           </w:p>
         </w:tc>
@@ -782,30 +719,17 @@
           </w:tcPr>
           <w:p>
             <w:r>
-              <w:t xml:space="preserve">Se añadieron validaciones en el apartado de cotizaciones para que no se permitirá registrar una cotización si la cantidad que </w:t>
-            </w:r>
-            <w:proofErr w:type="spellStart"/>
-            <w:r>
-              <w:t>s</w:t>
-            </w:r>
-            <w:proofErr w:type="spellEnd"/>
-            <w:r>
-              <w:t xml:space="preserve"> desea guardar es mayor a la cantidad disponible en stock.</w:t>
-            </w:r>
-          </w:p>
-        </w:tc>
-        <w:tc>
-          <w:tcPr>
-            <w:tcW w:w="2186" w:type="dxa"/>
-          </w:tcPr>
-          <w:p>
-            <w:proofErr w:type="spellStart"/>
-            <w:r>
-              <w:t>Duvan</w:t>
-            </w:r>
-            <w:proofErr w:type="spellEnd"/>
-            <w:r>
-              <w:t xml:space="preserve"> A.</w:t>
+              <w:t>Se añadieron validaciones en el apartado de cotizaciones para que no se permitirá registrar una cotización si la cantidad que s desea guardar es mayor a la cantidad disponible en stock.</w:t>
+            </w:r>
+          </w:p>
+        </w:tc>
+        <w:tc>
+          <w:tcPr>
+            <w:tcW w:w="2186" w:type="dxa"/>
+          </w:tcPr>
+          <w:p>
+            <w:r>
+              <w:t>Duvan A.</w:t>
             </w:r>
           </w:p>
         </w:tc>
@@ -1078,9 +1002,20 @@
             <w:tcW w:w="4379" w:type="dxa"/>
           </w:tcPr>
           <w:p>
+            <w:pPr>
+              <w:rPr>
+                <w:lang w:val="es-CO"/>
+              </w:rPr>
+            </w:pPr>
             <w:r>
               <w:t>Se inició la implementación de la edición de gastos, incorporando la opción para modificar registros existentes desde el módulo de gastos</w:t>
             </w:r>
+            <w:r>
+              <w:rPr>
+                <w:lang w:val="es-CO"/>
+              </w:rPr>
+              <w:t>.</w:t>
+            </w:r>
           </w:p>
         </w:tc>
         <w:tc>
@@ -1094,27 +1029,642 @@
           </w:p>
         </w:tc>
       </w:tr>
+      <w:tr>
+        <w:tc>
+          <w:tcPr>
+            <w:tcW w:w="793" w:type="dxa"/>
+          </w:tcPr>
+          <w:p>
+            <w:pPr>
+              <w:rPr>
+                <w:lang w:val="es-CO"/>
+              </w:rPr>
+            </w:pPr>
+            <w:r>
+              <w:rPr>
+                <w:lang w:val="es-CO"/>
+              </w:rPr>
+              <w:t>18</w:t>
+            </w:r>
+          </w:p>
+        </w:tc>
+        <w:tc>
+          <w:tcPr>
+            <w:tcW w:w="1470" w:type="dxa"/>
+          </w:tcPr>
+          <w:p>
+            <w:pPr>
+              <w:rPr>
+                <w:lang w:val="es-CO"/>
+              </w:rPr>
+            </w:pPr>
+            <w:r>
+              <w:rPr>
+                <w:lang w:val="es-CO"/>
+              </w:rPr>
+              <w:t>08/06/2026</w:t>
+            </w:r>
+          </w:p>
+        </w:tc>
+        <w:tc>
+          <w:tcPr>
+            <w:tcW w:w="4379" w:type="dxa"/>
+          </w:tcPr>
+          <w:p>
+            <w:pPr>
+              <w:rPr>
+                <w:lang w:val="es-CO"/>
+              </w:rPr>
+            </w:pPr>
+            <w:r>
+              <w:rPr>
+                <w:lang w:val="es-CO"/>
+              </w:rPr>
+              <w:t xml:space="preserve">Se realizaron algunas pruebas basadas en el plan de pruebas, con gran cantidad de resultados esperados. </w:t>
+            </w:r>
+          </w:p>
+        </w:tc>
+        <w:tc>
+          <w:tcPr>
+            <w:tcW w:w="2186" w:type="dxa"/>
+          </w:tcPr>
+          <w:p>
+            <w:pPr>
+              <w:rPr>
+                <w:lang w:val="es-CO"/>
+              </w:rPr>
+            </w:pPr>
+            <w:r>
+              <w:rPr>
+                <w:lang w:val="es-CO"/>
+              </w:rPr>
+              <w:t>Duvan A.</w:t>
+            </w:r>
+          </w:p>
+        </w:tc>
+      </w:tr>
+      <w:tr>
+        <w:tc>
+          <w:tcPr>
+            <w:tcW w:w="793" w:type="dxa"/>
+          </w:tcPr>
+          <w:p>
+            <w:pPr>
+              <w:rPr>
+                <w:lang w:val="es-CO"/>
+              </w:rPr>
+            </w:pPr>
+            <w:r>
+              <w:rPr>
+                <w:lang w:val="es-CO"/>
+              </w:rPr>
+              <w:lastRenderedPageBreak/>
+              <w:t>19</w:t>
+            </w:r>
+          </w:p>
+        </w:tc>
+        <w:tc>
+          <w:tcPr>
+            <w:tcW w:w="1470" w:type="dxa"/>
+          </w:tcPr>
+          <w:p>
+            <w:pPr>
+              <w:rPr>
+                <w:lang w:val="es-CO"/>
+              </w:rPr>
+            </w:pPr>
+            <w:r>
+              <w:rPr>
+                <w:lang w:val="es-CO"/>
+              </w:rPr>
+              <w:t>09/06/2026</w:t>
+            </w:r>
+          </w:p>
+        </w:tc>
+        <w:tc>
+          <w:tcPr>
+            <w:tcW w:w="4379" w:type="dxa"/>
+          </w:tcPr>
+          <w:p>
+            <w:pPr>
+              <w:rPr>
+                <w:lang w:val="es-CO"/>
+              </w:rPr>
+            </w:pPr>
+            <w:r>
+              <w:rPr>
+                <w:lang w:val="es-CO"/>
+              </w:rPr>
+              <w:t xml:space="preserve">Se realizaron las pruebas correspondientes al documento de pruebas y se da por terminadas las pruebas con algunas negativas </w:t>
+            </w:r>
+            <w:r>
+              <w:rPr>
+                <w:lang w:val="es-CO"/>
+              </w:rPr>
+              <w:t xml:space="preserve">a </w:t>
+            </w:r>
+            <w:r>
+              <w:rPr>
+                <w:lang w:val="es-CO"/>
+              </w:rPr>
+              <w:t xml:space="preserve">revisar y </w:t>
+            </w:r>
+            <w:r>
+              <w:rPr>
+                <w:lang w:val="es-CO"/>
+              </w:rPr>
+              <w:t>actualizar el sistema para que las pueda controlar con una respectiva salida.</w:t>
+            </w:r>
+          </w:p>
+        </w:tc>
+        <w:tc>
+          <w:tcPr>
+            <w:tcW w:w="2186" w:type="dxa"/>
+          </w:tcPr>
+          <w:p>
+            <w:pPr>
+              <w:rPr>
+                <w:lang w:val="es-CO"/>
+              </w:rPr>
+            </w:pPr>
+            <w:r>
+              <w:rPr>
+                <w:lang w:val="es-CO"/>
+              </w:rPr>
+              <w:t>Duvan A.</w:t>
+            </w:r>
+          </w:p>
+        </w:tc>
+      </w:tr>
+      <w:tr>
+        <w:tc>
+          <w:tcPr>
+            <w:tcW w:w="793" w:type="dxa"/>
+          </w:tcPr>
+          <w:p/>
+        </w:tc>
+        <w:tc>
+          <w:tcPr>
+            <w:tcW w:w="1470" w:type="dxa"/>
+          </w:tcPr>
+          <w:p/>
+        </w:tc>
+        <w:tc>
+          <w:tcPr>
+            <w:tcW w:w="4379" w:type="dxa"/>
+          </w:tcPr>
+          <w:p/>
+        </w:tc>
+        <w:tc>
+          <w:tcPr>
+            <w:tcW w:w="2186" w:type="dxa"/>
+          </w:tcPr>
+          <w:p/>
+        </w:tc>
+      </w:tr>
+      <w:tr>
+        <w:tc>
+          <w:tcPr>
+            <w:tcW w:w="793" w:type="dxa"/>
+          </w:tcPr>
+          <w:p/>
+        </w:tc>
+        <w:tc>
+          <w:tcPr>
+            <w:tcW w:w="1470" w:type="dxa"/>
+          </w:tcPr>
+          <w:p/>
+        </w:tc>
+        <w:tc>
+          <w:tcPr>
+            <w:tcW w:w="4379" w:type="dxa"/>
+          </w:tcPr>
+          <w:p/>
+        </w:tc>
+        <w:tc>
+          <w:tcPr>
+            <w:tcW w:w="2186" w:type="dxa"/>
+          </w:tcPr>
+          <w:p/>
+        </w:tc>
+      </w:tr>
+      <w:tr>
+        <w:tc>
+          <w:tcPr>
+            <w:tcW w:w="793" w:type="dxa"/>
+          </w:tcPr>
+          <w:p/>
+        </w:tc>
+        <w:tc>
+          <w:tcPr>
+            <w:tcW w:w="1470" w:type="dxa"/>
+          </w:tcPr>
+          <w:p/>
+        </w:tc>
+        <w:tc>
+          <w:tcPr>
+            <w:tcW w:w="4379" w:type="dxa"/>
+          </w:tcPr>
+          <w:p/>
+        </w:tc>
+        <w:tc>
+          <w:tcPr>
+            <w:tcW w:w="2186" w:type="dxa"/>
+          </w:tcPr>
+          <w:p/>
+        </w:tc>
+      </w:tr>
+      <w:tr>
+        <w:tc>
+          <w:tcPr>
+            <w:tcW w:w="793" w:type="dxa"/>
+          </w:tcPr>
+          <w:p/>
+        </w:tc>
+        <w:tc>
+          <w:tcPr>
+            <w:tcW w:w="1470" w:type="dxa"/>
+          </w:tcPr>
+          <w:p/>
+        </w:tc>
+        <w:tc>
+          <w:tcPr>
+            <w:tcW w:w="4379" w:type="dxa"/>
+          </w:tcPr>
+          <w:p/>
+        </w:tc>
+        <w:tc>
+          <w:tcPr>
+            <w:tcW w:w="2186" w:type="dxa"/>
+          </w:tcPr>
+          <w:p/>
+        </w:tc>
+      </w:tr>
+      <w:tr>
+        <w:tc>
+          <w:tcPr>
+            <w:tcW w:w="793" w:type="dxa"/>
+          </w:tcPr>
+          <w:p/>
+        </w:tc>
+        <w:tc>
+          <w:tcPr>
+            <w:tcW w:w="1470" w:type="dxa"/>
+          </w:tcPr>
+          <w:p/>
+        </w:tc>
+        <w:tc>
+          <w:tcPr>
+            <w:tcW w:w="4379" w:type="dxa"/>
+          </w:tcPr>
+          <w:p/>
+        </w:tc>
+        <w:tc>
+          <w:tcPr>
+            <w:tcW w:w="2186" w:type="dxa"/>
+          </w:tcPr>
+          <w:p/>
+        </w:tc>
+      </w:tr>
+      <w:tr>
+        <w:tc>
+          <w:tcPr>
+            <w:tcW w:w="793" w:type="dxa"/>
+          </w:tcPr>
+          <w:p/>
+        </w:tc>
+        <w:tc>
+          <w:tcPr>
+            <w:tcW w:w="1470" w:type="dxa"/>
+          </w:tcPr>
+          <w:p/>
+        </w:tc>
+        <w:tc>
+          <w:tcPr>
+            <w:tcW w:w="4379" w:type="dxa"/>
+          </w:tcPr>
+          <w:p/>
+        </w:tc>
+        <w:tc>
+          <w:tcPr>
+            <w:tcW w:w="2186" w:type="dxa"/>
+          </w:tcPr>
+          <w:p/>
+        </w:tc>
+      </w:tr>
+      <w:tr>
+        <w:tc>
+          <w:tcPr>
+            <w:tcW w:w="793" w:type="dxa"/>
+          </w:tcPr>
+          <w:p/>
+        </w:tc>
+        <w:tc>
+          <w:tcPr>
+            <w:tcW w:w="1470" w:type="dxa"/>
+          </w:tcPr>
+          <w:p/>
+        </w:tc>
+        <w:tc>
+          <w:tcPr>
+            <w:tcW w:w="4379" w:type="dxa"/>
+          </w:tcPr>
+          <w:p/>
+        </w:tc>
+        <w:tc>
+          <w:tcPr>
+            <w:tcW w:w="2186" w:type="dxa"/>
+          </w:tcPr>
+          <w:p/>
+        </w:tc>
+      </w:tr>
+      <w:tr>
+        <w:tc>
+          <w:tcPr>
+            <w:tcW w:w="793" w:type="dxa"/>
+          </w:tcPr>
+          <w:p/>
+        </w:tc>
+        <w:tc>
+          <w:tcPr>
+            <w:tcW w:w="1470" w:type="dxa"/>
+          </w:tcPr>
+          <w:p/>
+        </w:tc>
+        <w:tc>
+          <w:tcPr>
+            <w:tcW w:w="4379" w:type="dxa"/>
+          </w:tcPr>
+          <w:p/>
+        </w:tc>
+        <w:tc>
+          <w:tcPr>
+            <w:tcW w:w="2186" w:type="dxa"/>
+          </w:tcPr>
+          <w:p/>
+        </w:tc>
+      </w:tr>
+      <w:tr>
+        <w:tc>
+          <w:tcPr>
+            <w:tcW w:w="793" w:type="dxa"/>
+          </w:tcPr>
+          <w:p/>
+        </w:tc>
+        <w:tc>
+          <w:tcPr>
+            <w:tcW w:w="1470" w:type="dxa"/>
+          </w:tcPr>
+          <w:p/>
+        </w:tc>
+        <w:tc>
+          <w:tcPr>
+            <w:tcW w:w="4379" w:type="dxa"/>
+          </w:tcPr>
+          <w:p/>
+        </w:tc>
+        <w:tc>
+          <w:tcPr>
+            <w:tcW w:w="2186" w:type="dxa"/>
+          </w:tcPr>
+          <w:p/>
+        </w:tc>
+      </w:tr>
+      <w:tr>
+        <w:tc>
+          <w:tcPr>
+            <w:tcW w:w="793" w:type="dxa"/>
+          </w:tcPr>
+          <w:p/>
+        </w:tc>
+        <w:tc>
+          <w:tcPr>
+            <w:tcW w:w="1470" w:type="dxa"/>
+          </w:tcPr>
+          <w:p/>
+        </w:tc>
+        <w:tc>
+          <w:tcPr>
+            <w:tcW w:w="4379" w:type="dxa"/>
+          </w:tcPr>
+          <w:p/>
+        </w:tc>
+        <w:tc>
+          <w:tcPr>
+            <w:tcW w:w="2186" w:type="dxa"/>
+          </w:tcPr>
+          <w:p/>
+        </w:tc>
+      </w:tr>
+      <w:tr>
+        <w:tc>
+          <w:tcPr>
+            <w:tcW w:w="793" w:type="dxa"/>
+          </w:tcPr>
+          <w:p/>
+        </w:tc>
+        <w:tc>
+          <w:tcPr>
+            <w:tcW w:w="1470" w:type="dxa"/>
+          </w:tcPr>
+          <w:p/>
+        </w:tc>
+        <w:tc>
+          <w:tcPr>
+            <w:tcW w:w="4379" w:type="dxa"/>
+          </w:tcPr>
+          <w:p/>
+        </w:tc>
+        <w:tc>
+          <w:tcPr>
+            <w:tcW w:w="2186" w:type="dxa"/>
+          </w:tcPr>
+          <w:p/>
+        </w:tc>
+      </w:tr>
+      <w:tr>
+        <w:tc>
+          <w:tcPr>
+            <w:tcW w:w="793" w:type="dxa"/>
+          </w:tcPr>
+          <w:p/>
+        </w:tc>
+        <w:tc>
+          <w:tcPr>
+            <w:tcW w:w="1470" w:type="dxa"/>
+          </w:tcPr>
+          <w:p/>
+        </w:tc>
+        <w:tc>
+          <w:tcPr>
+            <w:tcW w:w="4379" w:type="dxa"/>
+          </w:tcPr>
+          <w:p/>
+        </w:tc>
+        <w:tc>
+          <w:tcPr>
+            <w:tcW w:w="2186" w:type="dxa"/>
+          </w:tcPr>
+          <w:p/>
+        </w:tc>
+      </w:tr>
+      <w:tr>
+        <w:tc>
+          <w:tcPr>
+            <w:tcW w:w="793" w:type="dxa"/>
+          </w:tcPr>
+          <w:p/>
+        </w:tc>
+        <w:tc>
+          <w:tcPr>
+            <w:tcW w:w="1470" w:type="dxa"/>
+          </w:tcPr>
+          <w:p/>
+        </w:tc>
+        <w:tc>
+          <w:tcPr>
+            <w:tcW w:w="4379" w:type="dxa"/>
+          </w:tcPr>
+          <w:p/>
+        </w:tc>
+        <w:tc>
+          <w:tcPr>
+            <w:tcW w:w="2186" w:type="dxa"/>
+          </w:tcPr>
+          <w:p/>
+        </w:tc>
+      </w:tr>
+      <w:tr>
+        <w:tc>
+          <w:tcPr>
+            <w:tcW w:w="793" w:type="dxa"/>
+          </w:tcPr>
+          <w:p/>
+        </w:tc>
+        <w:tc>
+          <w:tcPr>
+            <w:tcW w:w="1470" w:type="dxa"/>
+          </w:tcPr>
+          <w:p/>
+        </w:tc>
+        <w:tc>
+          <w:tcPr>
+            <w:tcW w:w="4379" w:type="dxa"/>
+          </w:tcPr>
+          <w:p/>
+        </w:tc>
+        <w:tc>
+          <w:tcPr>
+            <w:tcW w:w="2186" w:type="dxa"/>
+          </w:tcPr>
+          <w:p/>
+        </w:tc>
+      </w:tr>
+      <w:tr>
+        <w:tc>
+          <w:tcPr>
+            <w:tcW w:w="793" w:type="dxa"/>
+          </w:tcPr>
+          <w:p/>
+        </w:tc>
+        <w:tc>
+          <w:tcPr>
+            <w:tcW w:w="1470" w:type="dxa"/>
+          </w:tcPr>
+          <w:p/>
+        </w:tc>
+        <w:tc>
+          <w:tcPr>
+            <w:tcW w:w="4379" w:type="dxa"/>
+          </w:tcPr>
+          <w:p/>
+        </w:tc>
+        <w:tc>
+          <w:tcPr>
+            <w:tcW w:w="2186" w:type="dxa"/>
+          </w:tcPr>
+          <w:p/>
+        </w:tc>
+      </w:tr>
+      <w:tr>
+        <w:tc>
+          <w:tcPr>
+            <w:tcW w:w="793" w:type="dxa"/>
+          </w:tcPr>
+          <w:p/>
+        </w:tc>
+        <w:tc>
+          <w:tcPr>
+            <w:tcW w:w="1470" w:type="dxa"/>
+          </w:tcPr>
+          <w:p/>
+        </w:tc>
+        <w:tc>
+          <w:tcPr>
+            <w:tcW w:w="4379" w:type="dxa"/>
+          </w:tcPr>
+          <w:p/>
+        </w:tc>
+        <w:tc>
+          <w:tcPr>
+            <w:tcW w:w="2186" w:type="dxa"/>
+          </w:tcPr>
+          <w:p/>
+        </w:tc>
+      </w:tr>
+      <w:tr>
+        <w:tc>
+          <w:tcPr>
+            <w:tcW w:w="793" w:type="dxa"/>
+          </w:tcPr>
+          <w:p/>
+        </w:tc>
+        <w:tc>
+          <w:tcPr>
+            <w:tcW w:w="1470" w:type="dxa"/>
+          </w:tcPr>
+          <w:p/>
+        </w:tc>
+        <w:tc>
+          <w:tcPr>
+            <w:tcW w:w="4379" w:type="dxa"/>
+          </w:tcPr>
+          <w:p/>
+        </w:tc>
+        <w:tc>
+          <w:tcPr>
+            <w:tcW w:w="2186" w:type="dxa"/>
+          </w:tcPr>
+          <w:p/>
+        </w:tc>
+      </w:tr>
+      <w:tr>
+        <w:tc>
+          <w:tcPr>
+            <w:tcW w:w="793" w:type="dxa"/>
+          </w:tcPr>
+          <w:p/>
+        </w:tc>
+        <w:tc>
+          <w:tcPr>
+            <w:tcW w:w="1470" w:type="dxa"/>
+          </w:tcPr>
+          <w:p/>
+        </w:tc>
+        <w:tc>
+          <w:tcPr>
+            <w:tcW w:w="4379" w:type="dxa"/>
+          </w:tcPr>
+          <w:p/>
+        </w:tc>
+        <w:tc>
+          <w:tcPr>
+            <w:tcW w:w="2186" w:type="dxa"/>
+          </w:tcPr>
+          <w:p/>
+        </w:tc>
+      </w:tr>
     </w:tbl>
-    <w:p>
-      <w:pPr>
-        <w:jc w:val="center"/>
-        <w:rPr>
-          <w:b/>
-          <w:bCs/>
-          <w:i/>
-          <w:iCs/>
-        </w:rPr>
-      </w:pPr>
-      <w:r>
-        <w:rPr>
-          <w:b/>
-          <w:bCs/>
-          <w:i/>
-          <w:iCs/>
-        </w:rPr>
-        <w:t>LISTA DE CAMBIOS.</w:t>
-      </w:r>
-    </w:p>
     <w:p>
       <w:pPr>
         <w:jc w:val="center"/>
@@ -1137,7 +1687,7 @@
 </file>
 
 <file path=word/styles.xml><?xml version="1.0" encoding="utf-8"?>
-<w:styles xmlns:mc="http://schemas.openxmlformats.org/markup-compatibility/2006" xmlns:r="http://schemas.openxmlformats.org/officeDocument/2006/relationships" xmlns:w="http://schemas.openxmlformats.org/wordprocessingml/2006/main" xmlns:w14="http://schemas.microsoft.com/office/word/2010/wordml" xmlns:w15="http://schemas.microsoft.com/office/word/2012/wordml" xmlns:w16cex="http://schemas.microsoft.com/office/word/2018/wordml/cex" xmlns:w16cid="http://schemas.microsoft.com/office/word/2016/wordml/cid" xmlns:w16="http://schemas.microsoft.com/office/word/2018/wordml" xmlns:w16du="http://schemas.microsoft.com/office/word/2023/wordml/word16du" xmlns:w16sdtdh="http://schemas.microsoft.com/office/word/2020/wordml/sdtdatahash" xmlns:w16sdtfl="http://schemas.microsoft.com/office/word/2024/wordml/sdtformatlock" xmlns:w16se="http://schemas.microsoft.com/office/word/2015/wordml/symex" mc:Ignorable="w14 w15 w16se w16cid w16 w16cex w16sdtdh w16sdtfl w16du">
+<w:styles xmlns:mc="http://schemas.openxmlformats.org/markup-compatibility/2006" xmlns:r="http://schemas.openxmlformats.org/officeDocument/2006/relationships" xmlns:w="http://schemas.openxmlformats.org/wordprocessingml/2006/main" xmlns:w14="http://schemas.microsoft.com/office/word/2010/wordml" xmlns:w15="http://schemas.microsoft.com/office/word/2012/wordml" xmlns:w16cex="http://schemas.microsoft.com/office/word/2018/wordml/cex" xmlns:w16cid="http://schemas.microsoft.com/office/word/2016/wordml/cid" xmlns:w16="http://schemas.microsoft.com/office/word/2018/wordml" xmlns:w16sdtdh="http://schemas.microsoft.com/office/word/2020/wordml/sdtdatahash" xmlns:w16se="http://schemas.microsoft.com/office/word/2015/wordml/symex" mc:Ignorable="w14 w15 w16se w16cid w16 w16cex w16sdtdh">
   <w:docDefaults>
     <w:rPrDefault>
       <w:rPr>
@@ -1543,15 +2093,15 @@
     <w:rPr>
       <w:rFonts w:eastAsia="Times New Roman"/>
       <w:kern w:val="0"/>
-      <w:lang w:val="en-CO"/>
+      <w:lang/>
       <w14:ligatures w14:val="none"/>
     </w:rPr>
   </w:style>
-  <w:style w:type="paragraph" w:styleId="Heading1">
+  <w:style w:type="paragraph" w:styleId="Ttulo1">
     <w:name w:val="heading 1"/>
     <w:basedOn w:val="Normal"/>
     <w:next w:val="Normal"/>
-    <w:link w:val="Heading1Char"/>
+    <w:link w:val="Ttulo1Car"/>
     <w:uiPriority w:val="9"/>
     <w:qFormat/>
     <w:rsid w:val="00131CF7"/>
@@ -1571,11 +2121,11 @@
       <w14:ligatures w14:val="standardContextual"/>
     </w:rPr>
   </w:style>
-  <w:style w:type="paragraph" w:styleId="Heading2">
+  <w:style w:type="paragraph" w:styleId="Ttulo2">
     <w:name w:val="heading 2"/>
     <w:basedOn w:val="Normal"/>
     <w:next w:val="Normal"/>
-    <w:link w:val="Heading2Char"/>
+    <w:link w:val="Ttulo2Car"/>
     <w:uiPriority w:val="9"/>
     <w:semiHidden/>
     <w:unhideWhenUsed/>
@@ -1597,11 +2147,11 @@
       <w14:ligatures w14:val="standardContextual"/>
     </w:rPr>
   </w:style>
-  <w:style w:type="paragraph" w:styleId="Heading3">
+  <w:style w:type="paragraph" w:styleId="Ttulo3">
     <w:name w:val="heading 3"/>
     <w:basedOn w:val="Normal"/>
     <w:next w:val="Normal"/>
-    <w:link w:val="Heading3Char"/>
+    <w:link w:val="Ttulo3Car"/>
     <w:uiPriority w:val="9"/>
     <w:semiHidden/>
     <w:unhideWhenUsed/>
@@ -1623,11 +2173,11 @@
       <w14:ligatures w14:val="standardContextual"/>
     </w:rPr>
   </w:style>
-  <w:style w:type="paragraph" w:styleId="Heading4">
+  <w:style w:type="paragraph" w:styleId="Ttulo4">
     <w:name w:val="heading 4"/>
     <w:basedOn w:val="Normal"/>
     <w:next w:val="Normal"/>
-    <w:link w:val="Heading4Char"/>
+    <w:link w:val="Ttulo4Car"/>
     <w:uiPriority w:val="9"/>
     <w:semiHidden/>
     <w:unhideWhenUsed/>
@@ -1649,11 +2199,11 @@
       <w14:ligatures w14:val="standardContextual"/>
     </w:rPr>
   </w:style>
-  <w:style w:type="paragraph" w:styleId="Heading5">
+  <w:style w:type="paragraph" w:styleId="Ttulo5">
     <w:name w:val="heading 5"/>
     <w:basedOn w:val="Normal"/>
     <w:next w:val="Normal"/>
-    <w:link w:val="Heading5Char"/>
+    <w:link w:val="Ttulo5Car"/>
     <w:uiPriority w:val="9"/>
     <w:semiHidden/>
     <w:unhideWhenUsed/>
@@ -1673,11 +2223,11 @@
       <w14:ligatures w14:val="standardContextual"/>
     </w:rPr>
   </w:style>
-  <w:style w:type="paragraph" w:styleId="Heading6">
+  <w:style w:type="paragraph" w:styleId="Ttulo6">
     <w:name w:val="heading 6"/>
     <w:basedOn w:val="Normal"/>
     <w:next w:val="Normal"/>
-    <w:link w:val="Heading6Char"/>
+    <w:link w:val="Ttulo6Car"/>
     <w:uiPriority w:val="9"/>
     <w:semiHidden/>
     <w:unhideWhenUsed/>
@@ -1699,11 +2249,11 @@
       <w14:ligatures w14:val="standardContextual"/>
     </w:rPr>
   </w:style>
-  <w:style w:type="paragraph" w:styleId="Heading7">
+  <w:style w:type="paragraph" w:styleId="Ttulo7">
     <w:name w:val="heading 7"/>
     <w:basedOn w:val="Normal"/>
     <w:next w:val="Normal"/>
-    <w:link w:val="Heading7Char"/>
+    <w:link w:val="Ttulo7Car"/>
     <w:uiPriority w:val="9"/>
     <w:semiHidden/>
     <w:unhideWhenUsed/>
@@ -1723,11 +2273,11 @@
       <w14:ligatures w14:val="standardContextual"/>
     </w:rPr>
   </w:style>
-  <w:style w:type="paragraph" w:styleId="Heading8">
+  <w:style w:type="paragraph" w:styleId="Ttulo8">
     <w:name w:val="heading 8"/>
     <w:basedOn w:val="Normal"/>
     <w:next w:val="Normal"/>
-    <w:link w:val="Heading8Char"/>
+    <w:link w:val="Ttulo8Car"/>
     <w:uiPriority w:val="9"/>
     <w:semiHidden/>
     <w:unhideWhenUsed/>
@@ -1749,11 +2299,11 @@
       <w14:ligatures w14:val="standardContextual"/>
     </w:rPr>
   </w:style>
-  <w:style w:type="paragraph" w:styleId="Heading9">
+  <w:style w:type="paragraph" w:styleId="Ttulo9">
     <w:name w:val="heading 9"/>
     <w:basedOn w:val="Normal"/>
     <w:next w:val="Normal"/>
-    <w:link w:val="Heading9Char"/>
+    <w:link w:val="Ttulo9Car"/>
     <w:uiPriority w:val="9"/>
     <w:semiHidden/>
     <w:unhideWhenUsed/>
@@ -1773,13 +2323,13 @@
       <w14:ligatures w14:val="standardContextual"/>
     </w:rPr>
   </w:style>
-  <w:style w:type="character" w:default="1" w:styleId="DefaultParagraphFont">
+  <w:style w:type="character" w:default="1" w:styleId="Fuentedeprrafopredeter">
     <w:name w:val="Default Paragraph Font"/>
     <w:uiPriority w:val="1"/>
     <w:semiHidden/>
     <w:unhideWhenUsed/>
   </w:style>
-  <w:style w:type="table" w:default="1" w:styleId="TableNormal">
+  <w:style w:type="table" w:default="1" w:styleId="Tablanormal">
     <w:name w:val="Normal Table"/>
     <w:uiPriority w:val="99"/>
     <w:semiHidden/>
@@ -1794,16 +2344,16 @@
       </w:tblCellMar>
     </w:tblPr>
   </w:style>
-  <w:style w:type="numbering" w:default="1" w:styleId="NoList">
+  <w:style w:type="numbering" w:default="1" w:styleId="Sinlista">
     <w:name w:val="No List"/>
     <w:uiPriority w:val="99"/>
     <w:semiHidden/>
     <w:unhideWhenUsed/>
   </w:style>
-  <w:style w:type="character" w:customStyle="1" w:styleId="Heading1Char">
-    <w:name w:val="Heading 1 Char"/>
-    <w:basedOn w:val="DefaultParagraphFont"/>
-    <w:link w:val="Heading1"/>
+  <w:style w:type="character" w:customStyle="1" w:styleId="Ttulo1Car">
+    <w:name w:val="Título 1 Car"/>
+    <w:basedOn w:val="Fuentedeprrafopredeter"/>
+    <w:link w:val="Ttulo1"/>
     <w:uiPriority w:val="9"/>
     <w:rsid w:val="00131CF7"/>
     <w:rPr>
@@ -1813,10 +2363,10 @@
       <w:szCs w:val="40"/>
     </w:rPr>
   </w:style>
-  <w:style w:type="character" w:customStyle="1" w:styleId="Heading2Char">
-    <w:name w:val="Heading 2 Char"/>
-    <w:basedOn w:val="DefaultParagraphFont"/>
-    <w:link w:val="Heading2"/>
+  <w:style w:type="character" w:customStyle="1" w:styleId="Ttulo2Car">
+    <w:name w:val="Título 2 Car"/>
+    <w:basedOn w:val="Fuentedeprrafopredeter"/>
+    <w:link w:val="Ttulo2"/>
     <w:uiPriority w:val="9"/>
     <w:semiHidden/>
     <w:rsid w:val="00131CF7"/>
@@ -1827,10 +2377,10 @@
       <w:szCs w:val="32"/>
     </w:rPr>
   </w:style>
-  <w:style w:type="character" w:customStyle="1" w:styleId="Heading3Char">
-    <w:name w:val="Heading 3 Char"/>
-    <w:basedOn w:val="DefaultParagraphFont"/>
-    <w:link w:val="Heading3"/>
+  <w:style w:type="character" w:customStyle="1" w:styleId="Ttulo3Car">
+    <w:name w:val="Título 3 Car"/>
+    <w:basedOn w:val="Fuentedeprrafopredeter"/>
+    <w:link w:val="Ttulo3"/>
     <w:uiPriority w:val="9"/>
     <w:semiHidden/>
     <w:rsid w:val="00131CF7"/>
@@ -1841,10 +2391,10 @@
       <w:szCs w:val="28"/>
     </w:rPr>
   </w:style>
-  <w:style w:type="character" w:customStyle="1" w:styleId="Heading4Char">
-    <w:name w:val="Heading 4 Char"/>
-    <w:basedOn w:val="DefaultParagraphFont"/>
-    <w:link w:val="Heading4"/>
+  <w:style w:type="character" w:customStyle="1" w:styleId="Ttulo4Car">
+    <w:name w:val="Título 4 Car"/>
+    <w:basedOn w:val="Fuentedeprrafopredeter"/>
+    <w:link w:val="Ttulo4"/>
     <w:uiPriority w:val="9"/>
     <w:semiHidden/>
     <w:rsid w:val="00131CF7"/>
@@ -1855,10 +2405,10 @@
       <w:color w:val="0F4761" w:themeColor="accent1" w:themeShade="BF"/>
     </w:rPr>
   </w:style>
-  <w:style w:type="character" w:customStyle="1" w:styleId="Heading5Char">
-    <w:name w:val="Heading 5 Char"/>
-    <w:basedOn w:val="DefaultParagraphFont"/>
-    <w:link w:val="Heading5"/>
+  <w:style w:type="character" w:customStyle="1" w:styleId="Ttulo5Car">
+    <w:name w:val="Título 5 Car"/>
+    <w:basedOn w:val="Fuentedeprrafopredeter"/>
+    <w:link w:val="Ttulo5"/>
     <w:uiPriority w:val="9"/>
     <w:semiHidden/>
     <w:rsid w:val="00131CF7"/>
@@ -1867,10 +2417,10 @@
       <w:color w:val="0F4761" w:themeColor="accent1" w:themeShade="BF"/>
     </w:rPr>
   </w:style>
-  <w:style w:type="character" w:customStyle="1" w:styleId="Heading6Char">
-    <w:name w:val="Heading 6 Char"/>
-    <w:basedOn w:val="DefaultParagraphFont"/>
-    <w:link w:val="Heading6"/>
+  <w:style w:type="character" w:customStyle="1" w:styleId="Ttulo6Car">
+    <w:name w:val="Título 6 Car"/>
+    <w:basedOn w:val="Fuentedeprrafopredeter"/>
+    <w:link w:val="Ttulo6"/>
     <w:uiPriority w:val="9"/>
     <w:semiHidden/>
     <w:rsid w:val="00131CF7"/>
@@ -1881,10 +2431,10 @@
       <w:color w:val="595959" w:themeColor="text1" w:themeTint="A6"/>
     </w:rPr>
   </w:style>
-  <w:style w:type="character" w:customStyle="1" w:styleId="Heading7Char">
-    <w:name w:val="Heading 7 Char"/>
-    <w:basedOn w:val="DefaultParagraphFont"/>
-    <w:link w:val="Heading7"/>
+  <w:style w:type="character" w:customStyle="1" w:styleId="Ttulo7Car">
+    <w:name w:val="Título 7 Car"/>
+    <w:basedOn w:val="Fuentedeprrafopredeter"/>
+    <w:link w:val="Ttulo7"/>
     <w:uiPriority w:val="9"/>
     <w:semiHidden/>
     <w:rsid w:val="00131CF7"/>
@@ -1893,10 +2443,10 @@
       <w:color w:val="595959" w:themeColor="text1" w:themeTint="A6"/>
     </w:rPr>
   </w:style>
-  <w:style w:type="character" w:customStyle="1" w:styleId="Heading8Char">
-    <w:name w:val="Heading 8 Char"/>
-    <w:basedOn w:val="DefaultParagraphFont"/>
-    <w:link w:val="Heading8"/>
+  <w:style w:type="character" w:customStyle="1" w:styleId="Ttulo8Car">
+    <w:name w:val="Título 8 Car"/>
+    <w:basedOn w:val="Fuentedeprrafopredeter"/>
+    <w:link w:val="Ttulo8"/>
     <w:uiPriority w:val="9"/>
     <w:semiHidden/>
     <w:rsid w:val="00131CF7"/>
@@ -1907,10 +2457,10 @@
       <w:color w:val="272727" w:themeColor="text1" w:themeTint="D8"/>
     </w:rPr>
   </w:style>
-  <w:style w:type="character" w:customStyle="1" w:styleId="Heading9Char">
-    <w:name w:val="Heading 9 Char"/>
-    <w:basedOn w:val="DefaultParagraphFont"/>
-    <w:link w:val="Heading9"/>
+  <w:style w:type="character" w:customStyle="1" w:styleId="Ttulo9Car">
+    <w:name w:val="Título 9 Car"/>
+    <w:basedOn w:val="Fuentedeprrafopredeter"/>
+    <w:link w:val="Ttulo9"/>
     <w:uiPriority w:val="9"/>
     <w:semiHidden/>
     <w:rsid w:val="00131CF7"/>
@@ -1919,11 +2469,11 @@
       <w:color w:val="272727" w:themeColor="text1" w:themeTint="D8"/>
     </w:rPr>
   </w:style>
-  <w:style w:type="paragraph" w:styleId="Title">
+  <w:style w:type="paragraph" w:styleId="Ttulo">
     <w:name w:val="Title"/>
     <w:basedOn w:val="Normal"/>
     <w:next w:val="Normal"/>
-    <w:link w:val="TitleChar"/>
+    <w:link w:val="TtuloCar"/>
     <w:uiPriority w:val="10"/>
     <w:qFormat/>
     <w:rsid w:val="00131CF7"/>
@@ -1941,10 +2491,10 @@
       <w14:ligatures w14:val="standardContextual"/>
     </w:rPr>
   </w:style>
-  <w:style w:type="character" w:customStyle="1" w:styleId="TitleChar">
-    <w:name w:val="Title Char"/>
-    <w:basedOn w:val="DefaultParagraphFont"/>
-    <w:link w:val="Title"/>
+  <w:style w:type="character" w:customStyle="1" w:styleId="TtuloCar">
+    <w:name w:val="Título Car"/>
+    <w:basedOn w:val="Fuentedeprrafopredeter"/>
+    <w:link w:val="Ttulo"/>
     <w:uiPriority w:val="10"/>
     <w:rsid w:val="00131CF7"/>
     <w:rPr>
@@ -1955,11 +2505,11 @@
       <w:szCs w:val="56"/>
     </w:rPr>
   </w:style>
-  <w:style w:type="paragraph" w:styleId="Subtitle">
+  <w:style w:type="paragraph" w:styleId="Subttulo">
     <w:name w:val="Subtitle"/>
     <w:basedOn w:val="Normal"/>
     <w:next w:val="Normal"/>
-    <w:link w:val="SubtitleChar"/>
+    <w:link w:val="SubttuloCar"/>
     <w:uiPriority w:val="11"/>
     <w:qFormat/>
     <w:rsid w:val="00131CF7"/>
@@ -1980,10 +2530,10 @@
       <w14:ligatures w14:val="standardContextual"/>
     </w:rPr>
   </w:style>
-  <w:style w:type="character" w:customStyle="1" w:styleId="SubtitleChar">
-    <w:name w:val="Subtitle Char"/>
-    <w:basedOn w:val="DefaultParagraphFont"/>
-    <w:link w:val="Subtitle"/>
+  <w:style w:type="character" w:customStyle="1" w:styleId="SubttuloCar">
+    <w:name w:val="Subtítulo Car"/>
+    <w:basedOn w:val="Fuentedeprrafopredeter"/>
+    <w:link w:val="Subttulo"/>
     <w:uiPriority w:val="11"/>
     <w:rsid w:val="00131CF7"/>
     <w:rPr>
@@ -1994,11 +2544,11 @@
       <w:szCs w:val="28"/>
     </w:rPr>
   </w:style>
-  <w:style w:type="paragraph" w:styleId="Quote">
+  <w:style w:type="paragraph" w:styleId="Cita">
     <w:name w:val="Quote"/>
     <w:basedOn w:val="Normal"/>
     <w:next w:val="Normal"/>
-    <w:link w:val="QuoteChar"/>
+    <w:link w:val="CitaCar"/>
     <w:uiPriority w:val="29"/>
     <w:qFormat/>
     <w:rsid w:val="00131CF7"/>
@@ -2016,10 +2566,10 @@
       <w14:ligatures w14:val="standardContextual"/>
     </w:rPr>
   </w:style>
-  <w:style w:type="character" w:customStyle="1" w:styleId="QuoteChar">
-    <w:name w:val="Quote Char"/>
-    <w:basedOn w:val="DefaultParagraphFont"/>
-    <w:link w:val="Quote"/>
+  <w:style w:type="character" w:customStyle="1" w:styleId="CitaCar">
+    <w:name w:val="Cita Car"/>
+    <w:basedOn w:val="Fuentedeprrafopredeter"/>
+    <w:link w:val="Cita"/>
     <w:uiPriority w:val="29"/>
     <w:rsid w:val="00131CF7"/>
     <w:rPr>
@@ -2028,7 +2578,7 @@
       <w:color w:val="404040" w:themeColor="text1" w:themeTint="BF"/>
     </w:rPr>
   </w:style>
-  <w:style w:type="paragraph" w:styleId="ListParagraph">
+  <w:style w:type="paragraph" w:styleId="Prrafodelista">
     <w:name w:val="List Paragraph"/>
     <w:basedOn w:val="Normal"/>
     <w:uiPriority w:val="34"/>
@@ -2046,9 +2596,9 @@
       <w14:ligatures w14:val="standardContextual"/>
     </w:rPr>
   </w:style>
-  <w:style w:type="character" w:styleId="IntenseEmphasis">
+  <w:style w:type="character" w:styleId="nfasisintenso">
     <w:name w:val="Intense Emphasis"/>
-    <w:basedOn w:val="DefaultParagraphFont"/>
+    <w:basedOn w:val="Fuentedeprrafopredeter"/>
     <w:uiPriority w:val="21"/>
     <w:qFormat/>
     <w:rsid w:val="00131CF7"/>
@@ -2058,11 +2608,11 @@
       <w:color w:val="0F4761" w:themeColor="accent1" w:themeShade="BF"/>
     </w:rPr>
   </w:style>
-  <w:style w:type="paragraph" w:styleId="IntenseQuote">
+  <w:style w:type="paragraph" w:styleId="Citadestacada">
     <w:name w:val="Intense Quote"/>
     <w:basedOn w:val="Normal"/>
     <w:next w:val="Normal"/>
-    <w:link w:val="IntenseQuoteChar"/>
+    <w:link w:val="CitadestacadaCar"/>
     <w:uiPriority w:val="30"/>
     <w:qFormat/>
     <w:rsid w:val="00131CF7"/>
@@ -2085,10 +2635,10 @@
       <w14:ligatures w14:val="standardContextual"/>
     </w:rPr>
   </w:style>
-  <w:style w:type="character" w:customStyle="1" w:styleId="IntenseQuoteChar">
-    <w:name w:val="Intense Quote Char"/>
-    <w:basedOn w:val="DefaultParagraphFont"/>
-    <w:link w:val="IntenseQuote"/>
+  <w:style w:type="character" w:customStyle="1" w:styleId="CitadestacadaCar">
+    <w:name w:val="Cita destacada Car"/>
+    <w:basedOn w:val="Fuentedeprrafopredeter"/>
+    <w:link w:val="Citadestacada"/>
     <w:uiPriority w:val="30"/>
     <w:rsid w:val="00131CF7"/>
     <w:rPr>
@@ -2097,9 +2647,9 @@
       <w:color w:val="0F4761" w:themeColor="accent1" w:themeShade="BF"/>
     </w:rPr>
   </w:style>
-  <w:style w:type="character" w:styleId="IntenseReference">
+  <w:style w:type="character" w:styleId="Referenciaintensa">
     <w:name w:val="Intense Reference"/>
-    <w:basedOn w:val="DefaultParagraphFont"/>
+    <w:basedOn w:val="Fuentedeprrafopredeter"/>
     <w:uiPriority w:val="32"/>
     <w:qFormat/>
     <w:rsid w:val="00131CF7"/>
@@ -2111,9 +2661,9 @@
       <w:spacing w:val="5"/>
     </w:rPr>
   </w:style>
-  <w:style w:type="table" w:styleId="TableGrid">
+  <w:style w:type="table" w:styleId="Tablaconcuadrcula">
     <w:name w:val="Table Grid"/>
-    <w:basedOn w:val="TableNormal"/>
+    <w:basedOn w:val="Tablanormal"/>
     <w:uiPriority w:val="39"/>
     <w:rsid w:val="00131CF7"/>
     <w:pPr>

</xml_diff>

<commit_message>
Lista de cambios actualizada
</commit_message>
<xml_diff>
--- a/docs/gestion/LIsta-de-cambios.docx
+++ b/docs/gestion/LIsta-de-cambios.docx
@@ -919,8 +919,18 @@
           </w:tcPr>
           <w:p>
             <w:r>
-              <w:t>Se incorporó la opción de precio personalizado en las cotizaciones, permitiendo aplicar valores especiales según cliente o cantidad, manteniendo el precio general del producto en el módulo de inventario.</w:t>
-            </w:r>
+              <w:t xml:space="preserve">Se incorporó la opción de precio personalizado en las cotizaciones, permitiendo aplicar valores especiales según cliente o cantidad, manteniendo el precio general del producto en el módulo de </w:t>
+            </w:r>
+            <w:proofErr w:type="spellStart"/>
+            <w:proofErr w:type="gramStart"/>
+            <w:r>
+              <w:t>inventario.</w:t>
+            </w:r>
+            <w:r>
+              <w:t>s</w:t>
+            </w:r>
+            <w:proofErr w:type="spellEnd"/>
+            <w:proofErr w:type="gramEnd"/>
           </w:p>
         </w:tc>
         <w:tc>
@@ -1000,278 +1010,280 @@
         <w:tc>
           <w:tcPr>
             <w:tcW w:w="4379" w:type="dxa"/>
+          </w:tcPr>
+          <w:p>
+            <w:r>
+              <w:t>Se inició la implementación de la edición de gastos, incorporando la opción para modificar registros existentes desde el módulo de gastos</w:t>
+            </w:r>
+            <w:r>
+              <w:t>.</w:t>
+            </w:r>
+          </w:p>
+        </w:tc>
+        <w:tc>
+          <w:tcPr>
+            <w:tcW w:w="2186" w:type="dxa"/>
+          </w:tcPr>
+          <w:p>
+            <w:r>
+              <w:t>Salomé A.</w:t>
+            </w:r>
+          </w:p>
+        </w:tc>
+      </w:tr>
+      <w:tr>
+        <w:tc>
+          <w:tcPr>
+            <w:tcW w:w="793" w:type="dxa"/>
+          </w:tcPr>
+          <w:p>
+            <w:r>
+              <w:t>18</w:t>
+            </w:r>
+          </w:p>
+        </w:tc>
+        <w:tc>
+          <w:tcPr>
+            <w:tcW w:w="1470" w:type="dxa"/>
+          </w:tcPr>
+          <w:p>
+            <w:r>
+              <w:t>08/06/2026</w:t>
+            </w:r>
+          </w:p>
+        </w:tc>
+        <w:tc>
+          <w:tcPr>
+            <w:tcW w:w="4379" w:type="dxa"/>
+          </w:tcPr>
+          <w:p>
+            <w:r>
+              <w:t xml:space="preserve">Se realizaron algunas pruebas basadas en el plan de pruebas, con gran cantidad de resultados esperados. </w:t>
+            </w:r>
+          </w:p>
+        </w:tc>
+        <w:tc>
+          <w:tcPr>
+            <w:tcW w:w="2186" w:type="dxa"/>
+          </w:tcPr>
+          <w:p>
+            <w:r>
+              <w:t>Duvan A.</w:t>
+            </w:r>
+          </w:p>
+        </w:tc>
+      </w:tr>
+      <w:tr>
+        <w:tc>
+          <w:tcPr>
+            <w:tcW w:w="793" w:type="dxa"/>
+          </w:tcPr>
+          <w:p>
+            <w:r>
+              <w:lastRenderedPageBreak/>
+              <w:t>19</w:t>
+            </w:r>
+          </w:p>
+        </w:tc>
+        <w:tc>
+          <w:tcPr>
+            <w:tcW w:w="1470" w:type="dxa"/>
+          </w:tcPr>
+          <w:p>
+            <w:r>
+              <w:t>09/06/2026</w:t>
+            </w:r>
+          </w:p>
+        </w:tc>
+        <w:tc>
+          <w:tcPr>
+            <w:tcW w:w="4379" w:type="dxa"/>
+          </w:tcPr>
+          <w:p>
+            <w:r>
+              <w:t xml:space="preserve">Se realizaron las pruebas correspondientes al documento de pruebas y se da por terminadas las pruebas con algunas negativas </w:t>
+            </w:r>
+            <w:r>
+              <w:t xml:space="preserve">a </w:t>
+            </w:r>
+            <w:r>
+              <w:t xml:space="preserve">revisar y </w:t>
+            </w:r>
+            <w:r>
+              <w:t>actualizar el sistema para que las pueda controlar con una respectiva salida.</w:t>
+            </w:r>
+          </w:p>
+        </w:tc>
+        <w:tc>
+          <w:tcPr>
+            <w:tcW w:w="2186" w:type="dxa"/>
+          </w:tcPr>
+          <w:p>
+            <w:r>
+              <w:t>Duvan A.</w:t>
+            </w:r>
+          </w:p>
+        </w:tc>
+      </w:tr>
+      <w:tr>
+        <w:tc>
+          <w:tcPr>
+            <w:tcW w:w="793" w:type="dxa"/>
+          </w:tcPr>
+          <w:p>
+            <w:r>
+              <w:t xml:space="preserve">20 </w:t>
+            </w:r>
+          </w:p>
+        </w:tc>
+        <w:tc>
+          <w:tcPr>
+            <w:tcW w:w="1470" w:type="dxa"/>
+          </w:tcPr>
+          <w:p>
+            <w:r>
+              <w:t>09/06/2026</w:t>
+            </w:r>
+          </w:p>
+        </w:tc>
+        <w:tc>
+          <w:tcPr>
+            <w:tcW w:w="4379" w:type="dxa"/>
+          </w:tcPr>
+          <w:p>
+            <w:r>
+              <w:t xml:space="preserve">Se añadió un nuevo enpoint para controlar las validaciones realizadas al login. </w:t>
+            </w:r>
+          </w:p>
+        </w:tc>
+        <w:tc>
+          <w:tcPr>
+            <w:tcW w:w="2186" w:type="dxa"/>
+          </w:tcPr>
+          <w:p>
+            <w:r>
+              <w:t>Duvan A.</w:t>
+            </w:r>
+          </w:p>
+        </w:tc>
+      </w:tr>
+      <w:tr>
+        <w:tc>
+          <w:tcPr>
+            <w:tcW w:w="793" w:type="dxa"/>
+          </w:tcPr>
+          <w:p>
+            <w:r>
+              <w:t>21</w:t>
+            </w:r>
+          </w:p>
+        </w:tc>
+        <w:tc>
+          <w:tcPr>
+            <w:tcW w:w="1470" w:type="dxa"/>
+          </w:tcPr>
+          <w:p>
+            <w:r>
+              <w:t>09/06/2026</w:t>
+            </w:r>
+          </w:p>
+        </w:tc>
+        <w:tc>
+          <w:tcPr>
+            <w:tcW w:w="4379" w:type="dxa"/>
+          </w:tcPr>
+          <w:p>
+            <w:r>
+              <w:t>Implementación de mejoras, validaciones en servicios como: ProductoService, GastoService, ClienteService, CotizacionService.</w:t>
+            </w:r>
+          </w:p>
+        </w:tc>
+        <w:tc>
+          <w:tcPr>
+            <w:tcW w:w="2186" w:type="dxa"/>
+          </w:tcPr>
+          <w:p>
+            <w:r>
+              <w:t>Duvan A.</w:t>
+            </w:r>
+          </w:p>
+        </w:tc>
+      </w:tr>
+      <w:tr>
+        <w:tc>
+          <w:tcPr>
+            <w:tcW w:w="793" w:type="dxa"/>
+          </w:tcPr>
+          <w:p>
+            <w:r>
+              <w:t>22</w:t>
+            </w:r>
+          </w:p>
+        </w:tc>
+        <w:tc>
+          <w:tcPr>
+            <w:tcW w:w="1470" w:type="dxa"/>
+          </w:tcPr>
+          <w:p>
+            <w:r>
+              <w:t>09/06/2026</w:t>
+            </w:r>
+          </w:p>
+        </w:tc>
+        <w:tc>
+          <w:tcPr>
+            <w:tcW w:w="4379" w:type="dxa"/>
+          </w:tcPr>
+          <w:p>
+            <w:r>
+              <w:t xml:space="preserve">Implementación de mejoras, seguridad y autenticación como: </w:t>
+            </w:r>
+            <w:r>
+              <w:rPr>
+                <w:b/>
+                <w:bCs/>
+              </w:rPr>
+              <w:t>LoginAttemptservice</w:t>
+            </w:r>
+            <w:r>
+              <w:t xml:space="preserve"> (para la cantidad de intentos fallidos permitidos), </w:t>
+            </w:r>
+            <w:r>
+              <w:rPr>
+                <w:b/>
+                <w:bCs/>
+              </w:rPr>
+              <w:t>AuthController</w:t>
+            </w:r>
+            <w:r>
+              <w:t xml:space="preserve"> (nuevo enpoint con formato de correo + contraseña la cual deberá incluir &gt;=8 caracteres de los cuales uno debe ser mayúscula) y </w:t>
+            </w:r>
+            <w:r>
+              <w:rPr>
+                <w:b/>
+                <w:bCs/>
+              </w:rPr>
+              <w:t>AuthService</w:t>
+            </w:r>
+            <w:r>
+              <w:t xml:space="preserve"> (método registrar () modificado para evitar duplicados en el correo).</w:t>
+            </w:r>
+          </w:p>
+        </w:tc>
+        <w:tc>
+          <w:tcPr>
+            <w:tcW w:w="2186" w:type="dxa"/>
           </w:tcPr>
           <w:p>
             <w:pPr>
               <w:rPr>
-                <w:lang w:val="es-CO"/>
+                <w:u w:val="single"/>
               </w:rPr>
             </w:pPr>
             <w:r>
-              <w:t>Se inició la implementación de la edición de gastos, incorporando la opción para modificar registros existentes desde el módulo de gastos</w:t>
-            </w:r>
-            <w:r>
-              <w:rPr>
-                <w:lang w:val="es-CO"/>
-              </w:rPr>
-              <w:t>.</w:t>
-            </w:r>
-          </w:p>
-        </w:tc>
-        <w:tc>
-          <w:tcPr>
-            <w:tcW w:w="2186" w:type="dxa"/>
-          </w:tcPr>
-          <w:p>
-            <w:r>
-              <w:t>Salomé A.</w:t>
-            </w:r>
-          </w:p>
-        </w:tc>
-      </w:tr>
-      <w:tr>
-        <w:tc>
-          <w:tcPr>
-            <w:tcW w:w="793" w:type="dxa"/>
-          </w:tcPr>
-          <w:p>
-            <w:pPr>
-              <w:rPr>
-                <w:lang w:val="es-CO"/>
-              </w:rPr>
-            </w:pPr>
-            <w:r>
-              <w:rPr>
-                <w:lang w:val="es-CO"/>
-              </w:rPr>
-              <w:t>18</w:t>
-            </w:r>
-          </w:p>
-        </w:tc>
-        <w:tc>
-          <w:tcPr>
-            <w:tcW w:w="1470" w:type="dxa"/>
-          </w:tcPr>
-          <w:p>
-            <w:pPr>
-              <w:rPr>
-                <w:lang w:val="es-CO"/>
-              </w:rPr>
-            </w:pPr>
-            <w:r>
-              <w:rPr>
-                <w:lang w:val="es-CO"/>
-              </w:rPr>
-              <w:t>08/06/2026</w:t>
-            </w:r>
-          </w:p>
-        </w:tc>
-        <w:tc>
-          <w:tcPr>
-            <w:tcW w:w="4379" w:type="dxa"/>
-          </w:tcPr>
-          <w:p>
-            <w:pPr>
-              <w:rPr>
-                <w:lang w:val="es-CO"/>
-              </w:rPr>
-            </w:pPr>
-            <w:r>
-              <w:rPr>
-                <w:lang w:val="es-CO"/>
-              </w:rPr>
-              <w:t xml:space="preserve">Se realizaron algunas pruebas basadas en el plan de pruebas, con gran cantidad de resultados esperados. </w:t>
-            </w:r>
-          </w:p>
-        </w:tc>
-        <w:tc>
-          <w:tcPr>
-            <w:tcW w:w="2186" w:type="dxa"/>
-          </w:tcPr>
-          <w:p>
-            <w:pPr>
-              <w:rPr>
-                <w:lang w:val="es-CO"/>
-              </w:rPr>
-            </w:pPr>
-            <w:r>
-              <w:rPr>
-                <w:lang w:val="es-CO"/>
-              </w:rPr>
-              <w:t>Duvan A.</w:t>
-            </w:r>
-          </w:p>
-        </w:tc>
-      </w:tr>
-      <w:tr>
-        <w:tc>
-          <w:tcPr>
-            <w:tcW w:w="793" w:type="dxa"/>
-          </w:tcPr>
-          <w:p>
-            <w:pPr>
-              <w:rPr>
-                <w:lang w:val="es-CO"/>
-              </w:rPr>
-            </w:pPr>
-            <w:r>
-              <w:rPr>
-                <w:lang w:val="es-CO"/>
-              </w:rPr>
-              <w:lastRenderedPageBreak/>
-              <w:t>19</w:t>
-            </w:r>
-          </w:p>
-        </w:tc>
-        <w:tc>
-          <w:tcPr>
-            <w:tcW w:w="1470" w:type="dxa"/>
-          </w:tcPr>
-          <w:p>
-            <w:pPr>
-              <w:rPr>
-                <w:lang w:val="es-CO"/>
-              </w:rPr>
-            </w:pPr>
-            <w:r>
-              <w:rPr>
-                <w:lang w:val="es-CO"/>
-              </w:rPr>
-              <w:t>09/06/2026</w:t>
-            </w:r>
-          </w:p>
-        </w:tc>
-        <w:tc>
-          <w:tcPr>
-            <w:tcW w:w="4379" w:type="dxa"/>
-          </w:tcPr>
-          <w:p>
-            <w:pPr>
-              <w:rPr>
-                <w:lang w:val="es-CO"/>
-              </w:rPr>
-            </w:pPr>
-            <w:r>
-              <w:rPr>
-                <w:lang w:val="es-CO"/>
-              </w:rPr>
-              <w:t xml:space="preserve">Se realizaron las pruebas correspondientes al documento de pruebas y se da por terminadas las pruebas con algunas negativas </w:t>
-            </w:r>
-            <w:r>
-              <w:rPr>
-                <w:lang w:val="es-CO"/>
-              </w:rPr>
-              <w:t xml:space="preserve">a </w:t>
-            </w:r>
-            <w:r>
-              <w:rPr>
-                <w:lang w:val="es-CO"/>
-              </w:rPr>
-              <w:t xml:space="preserve">revisar y </w:t>
-            </w:r>
-            <w:r>
-              <w:rPr>
-                <w:lang w:val="es-CO"/>
-              </w:rPr>
-              <w:t>actualizar el sistema para que las pueda controlar con una respectiva salida.</w:t>
-            </w:r>
-          </w:p>
-        </w:tc>
-        <w:tc>
-          <w:tcPr>
-            <w:tcW w:w="2186" w:type="dxa"/>
-          </w:tcPr>
-          <w:p>
-            <w:pPr>
-              <w:rPr>
-                <w:lang w:val="es-CO"/>
-              </w:rPr>
-            </w:pPr>
-            <w:r>
-              <w:rPr>
-                <w:lang w:val="es-CO"/>
-              </w:rPr>
-              <w:t>Duvan A.</w:t>
-            </w:r>
-          </w:p>
-        </w:tc>
-      </w:tr>
-      <w:tr>
-        <w:tc>
-          <w:tcPr>
-            <w:tcW w:w="793" w:type="dxa"/>
-          </w:tcPr>
-          <w:p/>
-        </w:tc>
-        <w:tc>
-          <w:tcPr>
-            <w:tcW w:w="1470" w:type="dxa"/>
-          </w:tcPr>
-          <w:p/>
-        </w:tc>
-        <w:tc>
-          <w:tcPr>
-            <w:tcW w:w="4379" w:type="dxa"/>
-          </w:tcPr>
-          <w:p/>
-        </w:tc>
-        <w:tc>
-          <w:tcPr>
-            <w:tcW w:w="2186" w:type="dxa"/>
-          </w:tcPr>
-          <w:p/>
-        </w:tc>
-      </w:tr>
-      <w:tr>
-        <w:tc>
-          <w:tcPr>
-            <w:tcW w:w="793" w:type="dxa"/>
-          </w:tcPr>
-          <w:p/>
-        </w:tc>
-        <w:tc>
-          <w:tcPr>
-            <w:tcW w:w="1470" w:type="dxa"/>
-          </w:tcPr>
-          <w:p/>
-        </w:tc>
-        <w:tc>
-          <w:tcPr>
-            <w:tcW w:w="4379" w:type="dxa"/>
-          </w:tcPr>
-          <w:p/>
-        </w:tc>
-        <w:tc>
-          <w:tcPr>
-            <w:tcW w:w="2186" w:type="dxa"/>
-          </w:tcPr>
-          <w:p/>
-        </w:tc>
-      </w:tr>
-      <w:tr>
-        <w:tc>
-          <w:tcPr>
-            <w:tcW w:w="793" w:type="dxa"/>
-          </w:tcPr>
-          <w:p/>
-        </w:tc>
-        <w:tc>
-          <w:tcPr>
-            <w:tcW w:w="1470" w:type="dxa"/>
-          </w:tcPr>
-          <w:p/>
-        </w:tc>
-        <w:tc>
-          <w:tcPr>
-            <w:tcW w:w="4379" w:type="dxa"/>
-          </w:tcPr>
-          <w:p/>
-        </w:tc>
-        <w:tc>
-          <w:tcPr>
-            <w:tcW w:w="2186" w:type="dxa"/>
-          </w:tcPr>
-          <w:p/>
+              <w:t xml:space="preserve">Duvan A. </w:t>
+            </w:r>
+          </w:p>
         </w:tc>
       </w:tr>
       <w:tr>
@@ -2093,7 +2105,6 @@
     <w:rPr>
       <w:rFonts w:eastAsia="Times New Roman"/>
       <w:kern w:val="0"/>
-      <w:lang/>
       <w14:ligatures w14:val="none"/>
     </w:rPr>
   </w:style>
@@ -2117,7 +2128,6 @@
       <w:kern w:val="2"/>
       <w:sz w:val="40"/>
       <w:szCs w:val="40"/>
-      <w:lang w:val="es-CO"/>
       <w14:ligatures w14:val="standardContextual"/>
     </w:rPr>
   </w:style>
@@ -2143,7 +2153,6 @@
       <w:kern w:val="2"/>
       <w:sz w:val="32"/>
       <w:szCs w:val="32"/>
-      <w:lang w:val="es-CO"/>
       <w14:ligatures w14:val="standardContextual"/>
     </w:rPr>
   </w:style>
@@ -2169,7 +2178,6 @@
       <w:kern w:val="2"/>
       <w:sz w:val="28"/>
       <w:szCs w:val="28"/>
-      <w:lang w:val="es-CO"/>
       <w14:ligatures w14:val="standardContextual"/>
     </w:rPr>
   </w:style>
@@ -2195,7 +2203,6 @@
       <w:iCs/>
       <w:color w:val="0F4761" w:themeColor="accent1" w:themeShade="BF"/>
       <w:kern w:val="2"/>
-      <w:lang w:val="es-CO"/>
       <w14:ligatures w14:val="standardContextual"/>
     </w:rPr>
   </w:style>
@@ -2219,7 +2226,6 @@
       <w:rFonts w:eastAsiaTheme="majorEastAsia" w:cstheme="majorBidi"/>
       <w:color w:val="0F4761" w:themeColor="accent1" w:themeShade="BF"/>
       <w:kern w:val="2"/>
-      <w:lang w:val="es-CO"/>
       <w14:ligatures w14:val="standardContextual"/>
     </w:rPr>
   </w:style>
@@ -2245,7 +2251,6 @@
       <w:iCs/>
       <w:color w:val="595959" w:themeColor="text1" w:themeTint="A6"/>
       <w:kern w:val="2"/>
-      <w:lang w:val="es-CO"/>
       <w14:ligatures w14:val="standardContextual"/>
     </w:rPr>
   </w:style>
@@ -2269,7 +2274,6 @@
       <w:rFonts w:eastAsiaTheme="majorEastAsia" w:cstheme="majorBidi"/>
       <w:color w:val="595959" w:themeColor="text1" w:themeTint="A6"/>
       <w:kern w:val="2"/>
-      <w:lang w:val="es-CO"/>
       <w14:ligatures w14:val="standardContextual"/>
     </w:rPr>
   </w:style>
@@ -2295,7 +2299,6 @@
       <w:iCs/>
       <w:color w:val="272727" w:themeColor="text1" w:themeTint="D8"/>
       <w:kern w:val="2"/>
-      <w:lang w:val="es-CO"/>
       <w14:ligatures w14:val="standardContextual"/>
     </w:rPr>
   </w:style>
@@ -2319,14 +2322,12 @@
       <w:rFonts w:eastAsiaTheme="majorEastAsia" w:cstheme="majorBidi"/>
       <w:color w:val="272727" w:themeColor="text1" w:themeTint="D8"/>
       <w:kern w:val="2"/>
-      <w:lang w:val="es-CO"/>
       <w14:ligatures w14:val="standardContextual"/>
     </w:rPr>
   </w:style>
   <w:style w:type="character" w:default="1" w:styleId="Fuentedeprrafopredeter">
     <w:name w:val="Default Paragraph Font"/>
     <w:uiPriority w:val="1"/>
-    <w:semiHidden/>
     <w:unhideWhenUsed/>
   </w:style>
   <w:style w:type="table" w:default="1" w:styleId="Tablanormal">
@@ -2487,7 +2488,6 @@
       <w:kern w:val="28"/>
       <w:sz w:val="56"/>
       <w:szCs w:val="56"/>
-      <w:lang w:val="es-CO"/>
       <w14:ligatures w14:val="standardContextual"/>
     </w:rPr>
   </w:style>
@@ -2526,7 +2526,6 @@
       <w:kern w:val="2"/>
       <w:sz w:val="28"/>
       <w:szCs w:val="28"/>
-      <w:lang w:val="es-CO"/>
       <w14:ligatures w14:val="standardContextual"/>
     </w:rPr>
   </w:style>
@@ -2562,7 +2561,6 @@
       <w:iCs/>
       <w:color w:val="404040" w:themeColor="text1" w:themeTint="BF"/>
       <w:kern w:val="2"/>
-      <w:lang w:val="es-CO"/>
       <w14:ligatures w14:val="standardContextual"/>
     </w:rPr>
   </w:style>
@@ -2592,7 +2590,6 @@
     <w:rPr>
       <w:rFonts w:eastAsiaTheme="minorHAnsi"/>
       <w:kern w:val="2"/>
-      <w:lang w:val="es-CO"/>
       <w14:ligatures w14:val="standardContextual"/>
     </w:rPr>
   </w:style>
@@ -2631,7 +2628,6 @@
       <w:iCs/>
       <w:color w:val="0F4761" w:themeColor="accent1" w:themeShade="BF"/>
       <w:kern w:val="2"/>
-      <w:lang w:val="es-CO"/>
       <w14:ligatures w14:val="standardContextual"/>
     </w:rPr>
   </w:style>
@@ -2679,6 +2675,29 @@
         <w:insideV w:val="single" w:sz="4" w:space="0" w:color="auto"/>
       </w:tblBorders>
     </w:tblPr>
+  </w:style>
+  <w:style w:type="character" w:styleId="Hipervnculo">
+    <w:name w:val="Hyperlink"/>
+    <w:basedOn w:val="Fuentedeprrafopredeter"/>
+    <w:uiPriority w:val="99"/>
+    <w:unhideWhenUsed/>
+    <w:rsid w:val="00B20521"/>
+    <w:rPr>
+      <w:color w:val="467886" w:themeColor="hyperlink"/>
+      <w:u w:val="single"/>
+    </w:rPr>
+  </w:style>
+  <w:style w:type="character" w:styleId="Mencinsinresolver">
+    <w:name w:val="Unresolved Mention"/>
+    <w:basedOn w:val="Fuentedeprrafopredeter"/>
+    <w:uiPriority w:val="99"/>
+    <w:semiHidden/>
+    <w:unhideWhenUsed/>
+    <w:rsid w:val="00B20521"/>
+    <w:rPr>
+      <w:color w:val="605E5C"/>
+      <w:shd w:val="clear" w:color="auto" w:fill="E1DFDD"/>
+    </w:rPr>
   </w:style>
 </w:styles>
 </file>

</xml_diff>

<commit_message>
Actualizacion de la tabla de entregables
</commit_message>
<xml_diff>
--- a/docs/gestion/LIsta-de-cambios.docx
+++ b/docs/gestion/LIsta-de-cambios.docx
@@ -1,6 +1,6 @@
 
 <file path=word/document.xml><?xml version="1.0" encoding="utf-8"?>
-<w:document xmlns:wpc="http://schemas.microsoft.com/office/word/2010/wordprocessingCanvas" xmlns:cx="http://schemas.microsoft.com/office/drawing/2014/chartex" xmlns:cx1="http://schemas.microsoft.com/office/drawing/2015/9/8/chartex" xmlns:cx2="http://schemas.microsoft.com/office/drawing/2015/10/21/chartex" xmlns:cx3="http://schemas.microsoft.com/office/drawing/2016/5/9/chartex" xmlns:cx4="http://schemas.microsoft.com/office/drawing/2016/5/10/chartex" xmlns:cx5="http://schemas.microsoft.com/office/drawing/2016/5/11/chartex" xmlns:cx6="http://schemas.microsoft.com/office/drawing/2016/5/12/chartex" xmlns:cx7="http://schemas.microsoft.com/office/drawing/2016/5/13/chartex" xmlns:cx8="http://schemas.microsoft.com/office/drawing/2016/5/14/chartex" xmlns:mc="http://schemas.openxmlformats.org/markup-compatibility/2006" xmlns:aink="http://schemas.microsoft.com/office/drawing/2016/ink" xmlns:am3d="http://schemas.microsoft.com/office/drawing/2017/model3d" xmlns:o="urn:schemas-microsoft-com:office:office" xmlns:oel="http://schemas.microsoft.com/office/2019/extlst" xmlns:r="http://schemas.openxmlformats.org/officeDocument/2006/relationships" xmlns:m="http://schemas.openxmlformats.org/officeDocument/2006/math" xmlns:v="urn:schemas-microsoft-com:vml" xmlns:wp14="http://schemas.microsoft.com/office/word/2010/wordprocessingDrawing" xmlns:wp="http://schemas.openxmlformats.org/drawingml/2006/wordprocessingDrawing" xmlns:w10="urn:schemas-microsoft-com:office:word" xmlns:w="http://schemas.openxmlformats.org/wordprocessingml/2006/main" xmlns:w14="http://schemas.microsoft.com/office/word/2010/wordml" xmlns:w15="http://schemas.microsoft.com/office/word/2012/wordml" xmlns:w16cex="http://schemas.microsoft.com/office/word/2018/wordml/cex" xmlns:w16cid="http://schemas.microsoft.com/office/word/2016/wordml/cid" xmlns:w16="http://schemas.microsoft.com/office/word/2018/wordml" xmlns:w16sdtdh="http://schemas.microsoft.com/office/word/2020/wordml/sdtdatahash" xmlns:w16se="http://schemas.microsoft.com/office/word/2015/wordml/symex" xmlns:wpg="http://schemas.microsoft.com/office/word/2010/wordprocessingGroup" xmlns:wpi="http://schemas.microsoft.com/office/word/2010/wordprocessingInk" xmlns:wne="http://schemas.microsoft.com/office/word/2006/wordml" xmlns:wps="http://schemas.microsoft.com/office/word/2010/wordprocessingShape" mc:Ignorable="w14 w15 w16se w16cid w16 w16cex w16sdtdh wp14">
+<w:document xmlns:wpc="http://schemas.microsoft.com/office/word/2010/wordprocessingCanvas" xmlns:cx="http://schemas.microsoft.com/office/drawing/2014/chartex" xmlns:cx1="http://schemas.microsoft.com/office/drawing/2015/9/8/chartex" xmlns:cx2="http://schemas.microsoft.com/office/drawing/2015/10/21/chartex" xmlns:cx3="http://schemas.microsoft.com/office/drawing/2016/5/9/chartex" xmlns:cx4="http://schemas.microsoft.com/office/drawing/2016/5/10/chartex" xmlns:cx5="http://schemas.microsoft.com/office/drawing/2016/5/11/chartex" xmlns:cx6="http://schemas.microsoft.com/office/drawing/2016/5/12/chartex" xmlns:cx7="http://schemas.microsoft.com/office/drawing/2016/5/13/chartex" xmlns:cx8="http://schemas.microsoft.com/office/drawing/2016/5/14/chartex" xmlns:mc="http://schemas.openxmlformats.org/markup-compatibility/2006" xmlns:aink="http://schemas.microsoft.com/office/drawing/2016/ink" xmlns:am3d="http://schemas.microsoft.com/office/drawing/2017/model3d" xmlns:o="urn:schemas-microsoft-com:office:office" xmlns:oel="http://schemas.microsoft.com/office/2019/extlst" xmlns:r="http://schemas.openxmlformats.org/officeDocument/2006/relationships" xmlns:m="http://schemas.openxmlformats.org/officeDocument/2006/math" xmlns:v="urn:schemas-microsoft-com:vml" xmlns:wp14="http://schemas.microsoft.com/office/word/2010/wordprocessingDrawing" xmlns:wp="http://schemas.openxmlformats.org/drawingml/2006/wordprocessingDrawing" xmlns:w10="urn:schemas-microsoft-com:office:word" xmlns:w="http://schemas.openxmlformats.org/wordprocessingml/2006/main" xmlns:w14="http://schemas.microsoft.com/office/word/2010/wordml" xmlns:w15="http://schemas.microsoft.com/office/word/2012/wordml" xmlns:w16cex="http://schemas.microsoft.com/office/word/2018/wordml/cex" xmlns:w16cid="http://schemas.microsoft.com/office/word/2016/wordml/cid" xmlns:w16="http://schemas.microsoft.com/office/word/2018/wordml" xmlns:w16du="http://schemas.microsoft.com/office/word/2023/wordml/word16du" xmlns:w16sdtdh="http://schemas.microsoft.com/office/word/2020/wordml/sdtdatahash" xmlns:w16sdtfl="http://schemas.microsoft.com/office/word/2024/wordml/sdtformatlock" xmlns:w16se="http://schemas.microsoft.com/office/word/2015/wordml/symex" xmlns:wpg="http://schemas.microsoft.com/office/word/2010/wordprocessingGroup" xmlns:wpi="http://schemas.microsoft.com/office/word/2010/wordprocessingInk" xmlns:wne="http://schemas.microsoft.com/office/word/2006/wordml" xmlns:wps="http://schemas.microsoft.com/office/word/2010/wordprocessingShape" mc:Ignorable="w14 w15 w16se w16cid w16 w16cex w16sdtdh w16sdtfl w16du wp14">
   <w:body>
     <w:tbl>
       <w:tblPr>
@@ -540,7 +540,65 @@
           </w:tcPr>
           <w:p>
             <w:r>
-              <w:t>8</w:t>
+              <w:t xml:space="preserve">8 </w:t>
+            </w:r>
+          </w:p>
+        </w:tc>
+        <w:tc>
+          <w:tcPr>
+            <w:tcW w:w="1470" w:type="dxa"/>
+          </w:tcPr>
+          <w:p>
+            <w:r>
+              <w:t>15/04/2026</w:t>
+            </w:r>
+          </w:p>
+        </w:tc>
+        <w:tc>
+          <w:tcPr>
+            <w:tcW w:w="4379" w:type="dxa"/>
+          </w:tcPr>
+          <w:p>
+            <w:r>
+              <w:t>Se añadió el documento “</w:t>
+            </w:r>
+            <w:proofErr w:type="spellStart"/>
+            <w:r>
+              <w:t>projectEmplanorte</w:t>
+            </w:r>
+            <w:proofErr w:type="spellEnd"/>
+            <w:r>
+              <w:t xml:space="preserve">”, para estimar los costos del proyecto, se subió a la rama actividades en la carpeta </w:t>
+            </w:r>
+            <w:proofErr w:type="spellStart"/>
+            <w:r>
+              <w:t>docs</w:t>
+            </w:r>
+            <w:proofErr w:type="spellEnd"/>
+            <w:r>
+              <w:t>/gestión.</w:t>
+            </w:r>
+          </w:p>
+        </w:tc>
+        <w:tc>
+          <w:tcPr>
+            <w:tcW w:w="2186" w:type="dxa"/>
+          </w:tcPr>
+          <w:p>
+            <w:r>
+              <w:t>Luis C.</w:t>
+            </w:r>
+          </w:p>
+        </w:tc>
+      </w:tr>
+      <w:tr>
+        <w:tc>
+          <w:tcPr>
+            <w:tcW w:w="793" w:type="dxa"/>
+          </w:tcPr>
+          <w:p>
+            <w:r>
+              <w:t>9</w:t>
             </w:r>
           </w:p>
         </w:tc>
@@ -582,7 +640,7 @@
           </w:tcPr>
           <w:p>
             <w:r>
-              <w:t>9</w:t>
+              <w:t>10</w:t>
             </w:r>
           </w:p>
         </w:tc>
@@ -615,6 +673,9 @@
             </w:r>
             <w:r>
               <w:br/>
+            </w:r>
+            <w:r>
+              <w:lastRenderedPageBreak/>
               <w:t>2. Modificación de la base de datos.</w:t>
             </w:r>
             <w:r>
@@ -629,7 +690,6 @@
           </w:p>
           <w:p>
             <w:r>
-              <w:lastRenderedPageBreak/>
               <w:t xml:space="preserve"> </w:t>
             </w:r>
           </w:p>
@@ -653,7 +713,10 @@
           </w:tcPr>
           <w:p>
             <w:r>
-              <w:t>10</w:t>
+              <w:t>1</w:t>
+            </w:r>
+            <w:r>
+              <w:t>1</w:t>
             </w:r>
           </w:p>
         </w:tc>
@@ -699,7 +762,10 @@
           </w:tcPr>
           <w:p>
             <w:r>
-              <w:t>11</w:t>
+              <w:t>1</w:t>
+            </w:r>
+            <w:r>
+              <w:t>2</w:t>
             </w:r>
           </w:p>
         </w:tc>
@@ -741,7 +807,10 @@
           </w:tcPr>
           <w:p>
             <w:r>
-              <w:t>12</w:t>
+              <w:t>1</w:t>
+            </w:r>
+            <w:r>
+              <w:t>3</w:t>
             </w:r>
           </w:p>
         </w:tc>
@@ -783,7 +852,10 @@
           </w:tcPr>
           <w:p>
             <w:r>
-              <w:t>13</w:t>
+              <w:t>1</w:t>
+            </w:r>
+            <w:r>
+              <w:t>4</w:t>
             </w:r>
           </w:p>
         </w:tc>
@@ -857,7 +929,10 @@
           </w:tcPr>
           <w:p>
             <w:r>
-              <w:t>14</w:t>
+              <w:t>1</w:t>
+            </w:r>
+            <w:r>
+              <w:t>5</w:t>
             </w:r>
           </w:p>
         </w:tc>
@@ -899,7 +974,10 @@
           </w:tcPr>
           <w:p>
             <w:r>
-              <w:t>15</w:t>
+              <w:t>1</w:t>
+            </w:r>
+            <w:r>
+              <w:t>6</w:t>
             </w:r>
           </w:p>
         </w:tc>
@@ -921,16 +999,9 @@
             <w:r>
               <w:t xml:space="preserve">Se incorporó la opción de precio personalizado en las cotizaciones, permitiendo aplicar valores especiales según cliente o cantidad, manteniendo el precio general del producto en el módulo de </w:t>
             </w:r>
-            <w:proofErr w:type="spellStart"/>
-            <w:proofErr w:type="gramStart"/>
-            <w:r>
-              <w:t>inventario.</w:t>
-            </w:r>
-            <w:r>
-              <w:t>s</w:t>
-            </w:r>
-            <w:proofErr w:type="spellEnd"/>
-            <w:proofErr w:type="gramEnd"/>
+            <w:r>
+              <w:t>inventarios</w:t>
+            </w:r>
           </w:p>
         </w:tc>
         <w:tc>
@@ -951,7 +1022,10 @@
           </w:tcPr>
           <w:p>
             <w:r>
-              <w:t>16</w:t>
+              <w:t>1</w:t>
+            </w:r>
+            <w:r>
+              <w:t>7</w:t>
             </w:r>
           </w:p>
         </w:tc>
@@ -993,7 +1067,10 @@
           </w:tcPr>
           <w:p>
             <w:r>
-              <w:t>17</w:t>
+              <w:t>1</w:t>
+            </w:r>
+            <w:r>
+              <w:t>8</w:t>
             </w:r>
           </w:p>
         </w:tc>
@@ -1013,7 +1090,11 @@
           </w:tcPr>
           <w:p>
             <w:r>
-              <w:t>Se inició la implementación de la edición de gastos, incorporando la opción para modificar registros existentes desde el módulo de gastos</w:t>
+              <w:t xml:space="preserve">Se inició la implementación de la edición de gastos, incorporando la opción para </w:t>
+            </w:r>
+            <w:r>
+              <w:lastRenderedPageBreak/>
+              <w:t>modificar registros existentes desde el módulo de gastos</w:t>
             </w:r>
             <w:r>
               <w:t>.</w:t>
@@ -1026,6 +1107,7 @@
           </w:tcPr>
           <w:p>
             <w:r>
+              <w:lastRenderedPageBreak/>
               <w:t>Salomé A.</w:t>
             </w:r>
           </w:p>
@@ -1038,7 +1120,10 @@
           </w:tcPr>
           <w:p>
             <w:r>
-              <w:t>18</w:t>
+              <w:t>1</w:t>
+            </w:r>
+            <w:r>
+              <w:t>9</w:t>
             </w:r>
           </w:p>
         </w:tc>
@@ -1080,8 +1165,7 @@
           </w:tcPr>
           <w:p>
             <w:r>
-              <w:lastRenderedPageBreak/>
-              <w:t>19</w:t>
+              <w:t>20</w:t>
             </w:r>
           </w:p>
         </w:tc>
@@ -1132,7 +1216,13 @@
           </w:tcPr>
           <w:p>
             <w:r>
-              <w:t xml:space="preserve">20 </w:t>
+              <w:t>2</w:t>
+            </w:r>
+            <w:r>
+              <w:t>1</w:t>
+            </w:r>
+            <w:r>
+              <w:t xml:space="preserve"> </w:t>
             </w:r>
           </w:p>
         </w:tc>
@@ -1174,7 +1264,10 @@
           </w:tcPr>
           <w:p>
             <w:r>
-              <w:t>21</w:t>
+              <w:t>2</w:t>
+            </w:r>
+            <w:r>
+              <w:t>2</w:t>
             </w:r>
           </w:p>
         </w:tc>
@@ -1216,7 +1309,10 @@
           </w:tcPr>
           <w:p>
             <w:r>
-              <w:t>22</w:t>
+              <w:t>2</w:t>
+            </w:r>
+            <w:r>
+              <w:t>3</w:t>
             </w:r>
           </w:p>
         </w:tc>
@@ -1699,7 +1795,7 @@
 </file>
 
 <file path=word/styles.xml><?xml version="1.0" encoding="utf-8"?>
-<w:styles xmlns:mc="http://schemas.openxmlformats.org/markup-compatibility/2006" xmlns:r="http://schemas.openxmlformats.org/officeDocument/2006/relationships" xmlns:w="http://schemas.openxmlformats.org/wordprocessingml/2006/main" xmlns:w14="http://schemas.microsoft.com/office/word/2010/wordml" xmlns:w15="http://schemas.microsoft.com/office/word/2012/wordml" xmlns:w16cex="http://schemas.microsoft.com/office/word/2018/wordml/cex" xmlns:w16cid="http://schemas.microsoft.com/office/word/2016/wordml/cid" xmlns:w16="http://schemas.microsoft.com/office/word/2018/wordml" xmlns:w16sdtdh="http://schemas.microsoft.com/office/word/2020/wordml/sdtdatahash" xmlns:w16se="http://schemas.microsoft.com/office/word/2015/wordml/symex" mc:Ignorable="w14 w15 w16se w16cid w16 w16cex w16sdtdh">
+<w:styles xmlns:mc="http://schemas.openxmlformats.org/markup-compatibility/2006" xmlns:r="http://schemas.openxmlformats.org/officeDocument/2006/relationships" xmlns:w="http://schemas.openxmlformats.org/wordprocessingml/2006/main" xmlns:w14="http://schemas.microsoft.com/office/word/2010/wordml" xmlns:w15="http://schemas.microsoft.com/office/word/2012/wordml" xmlns:w16cex="http://schemas.microsoft.com/office/word/2018/wordml/cex" xmlns:w16cid="http://schemas.microsoft.com/office/word/2016/wordml/cid" xmlns:w16="http://schemas.microsoft.com/office/word/2018/wordml" xmlns:w16du="http://schemas.microsoft.com/office/word/2023/wordml/word16du" xmlns:w16sdtdh="http://schemas.microsoft.com/office/word/2020/wordml/sdtdatahash" xmlns:w16sdtfl="http://schemas.microsoft.com/office/word/2024/wordml/sdtformatlock" xmlns:w16se="http://schemas.microsoft.com/office/word/2015/wordml/symex" mc:Ignorable="w14 w15 w16se w16cid w16 w16cex w16sdtdh w16sdtfl w16du">
   <w:docDefaults>
     <w:rPrDefault>
       <w:rPr>
@@ -2328,6 +2424,7 @@
   <w:style w:type="character" w:default="1" w:styleId="Fuentedeprrafopredeter">
     <w:name w:val="Default Paragraph Font"/>
     <w:uiPriority w:val="1"/>
+    <w:semiHidden/>
     <w:unhideWhenUsed/>
   </w:style>
   <w:style w:type="table" w:default="1" w:styleId="Tablanormal">

</xml_diff>